<commit_message>
BalloonFlow Round 2: difficulty formula redesign, BM/LiveOps deferral, cross-validation fixes
- Redesign difficulty formula: replace buffer_mult/special_ratio with
  gimmick_weight, estimated_return_rate, color_skew (holder overflow mechanic)
- Defer BM/LiveOps systems (37→33 confirmed), merge Phase 3+4 into Phase 3
- Fix 5 cross-validation failures (CV-001~CV-005): stale formula, phase assignment,
  status headers, domain_owner tags, terminology
- Add beat_chart.yaml, gimmick_spec.yaml, 2 new L3 nodes (balloon_board, holder_dart_pop)
- Add puzzle.yaml design standard (Stage 0)
- Rewrite generate_docs.py v5 to match current YAML structure (6 docx files)
- Add embed_to_mongodb.py + normalize_and_promote.py (Design DB pipeline)
- Remove 7 obsolete L3 nodes and 3 stale feedback JSONs

Co-Authored-By: Claude Opus 4.6 <noreply@anthropic.com>
</commit_message>
<xml_diff>
--- a/docs/BalloonFlow_BM_LiveOps설계서.docx
+++ b/docs/BalloonFlow_BM_LiveOps설계서.docx
@@ -24,9 +24,9 @@
           <w:color w:val="646464"/>
           <w:sz w:val="22"/>
         </w:rPr>
-        <w:t>수익화 구조 + 라이브 운영 계획</w:t>
+        <w:t>수익화 구조 + 라이브 운영 (컨셉 확정분)</w:t>
         <w:br/>
-        <w:t>2026. 03. 11 | BM &amp; LiveOps v1.0</w:t>
+        <w:t>BM &amp; LiveOps v2.0</w:t>
       </w:r>
     </w:p>
     <w:p/>
@@ -59,13 +59,13 @@
           <w:b/>
           <w:sz w:val="20"/>
         </w:rPr>
-        <w:t xml:space="preserve">광고 프리 기간: </w:t>
+        <w:t xml:space="preserve">범위: </w:t>
       </w:r>
       <w:r>
         <w:rPr>
           <w:sz w:val="20"/>
         </w:rPr>
-        <w:t>15분</w:t>
+        <w:t>1.0은 Static Pricing만. Dynamic Pricing은 소프트런칭 데이터 확인 후</w:t>
       </w:r>
     </w:p>
     <w:p>
@@ -74,13 +74,13 @@
           <w:b/>
           <w:sz w:val="20"/>
         </w:rPr>
-        <w:t xml:space="preserve">IAP 가격대: </w:t>
+        <w:t xml:space="preserve">BM 상태: </w:t>
       </w:r>
       <w:r>
         <w:rPr>
           <w:sz w:val="20"/>
         </w:rPr>
-        <w:t>$0.99 ~ $49.99</w:t>
+        <w:t>partial</w:t>
       </w:r>
     </w:p>
     <w:p>
@@ -88,7 +88,89 @@
         <w:pStyle w:val="Heading1"/>
       </w:pPr>
       <w:r>
-        <w:t>2. 보상형 광고</w:t>
+        <w:t>2. 가치 계산 체계</w:t>
+      </w:r>
+    </w:p>
+    <w:p>
+      <w:r>
+        <w:rPr>
+          <w:b/>
+          <w:sz w:val="20"/>
+        </w:rPr>
+        <w:t xml:space="preserve">기준점: </w:t>
+      </w:r>
+      <w:r>
+        <w:rPr>
+          <w:sz w:val="20"/>
+        </w:rPr>
+        <w:t>Standard Coin T1 ($0.99 = 900코인)</w:t>
+      </w:r>
+    </w:p>
+    <w:p>
+      <w:r>
+        <w:rPr>
+          <w:b/>
+          <w:sz w:val="20"/>
+        </w:rPr>
+        <w:t xml:space="preserve">코인/$: </w:t>
+      </w:r>
+      <w:r>
+        <w:rPr>
+          <w:sz w:val="20"/>
+        </w:rPr>
+        <w:t>909.09</w:t>
+      </w:r>
+    </w:p>
+    <w:p>
+      <w:pPr>
+        <w:pStyle w:val="Heading2"/>
+      </w:pPr>
+      <w:r>
+        <w:t>설계 원칙</w:t>
+      </w:r>
+    </w:p>
+    <w:p>
+      <w:pPr>
+        <w:pStyle w:val="ListBullet"/>
+        <w:ind w:left="850"/>
+      </w:pPr>
+      <w:r>
+        <w:t>Tier 1($0.99) = 이어하기 1회(900코인). 경제의 기준점</w:t>
+      </w:r>
+    </w:p>
+    <w:p>
+      <w:pPr>
+        <w:pStyle w:val="ListBullet"/>
+        <w:ind w:left="850"/>
+      </w:pPr>
+      <w:r>
+        <w:t>코인량은 이어하기 0.5회(450코인)의 배수</w:t>
+      </w:r>
+    </w:p>
+    <w:p>
+      <w:pPr>
+        <w:pStyle w:val="ListBullet"/>
+        <w:ind w:left="850"/>
+      </w:pPr>
+      <w:r>
+        <w:t>100, 500, 1000 등 딱 떨어지는 명료한 숫자 단위 우선</w:t>
+      </w:r>
+    </w:p>
+    <w:p>
+      <w:pPr>
+        <w:pStyle w:val="ListBullet"/>
+        <w:ind w:left="850"/>
+      </w:pPr>
+      <w:r>
+        <w:t>상위 가격 상품은 하위 가격 상품보다 총가치 반드시 높아야 함</w:t>
+      </w:r>
+    </w:p>
+    <w:p>
+      <w:pPr>
+        <w:pStyle w:val="Heading2"/>
+      </w:pPr>
+      <w:r>
+        <w:t>부스터 단위 가치</w:t>
       </w:r>
     </w:p>
     <w:tbl>
@@ -99,15 +181,14 @@
         <w:tblLook w:firstColumn="1" w:firstRow="1" w:lastColumn="0" w:lastRow="0" w:noHBand="0" w:noVBand="1" w:val="04A0"/>
       </w:tblPr>
       <w:tblGrid>
-        <w:gridCol w:w="2160"/>
-        <w:gridCol w:w="2160"/>
-        <w:gridCol w:w="2160"/>
-        <w:gridCol w:w="2160"/>
+        <w:gridCol w:w="2880"/>
+        <w:gridCol w:w="2880"/>
+        <w:gridCol w:w="2880"/>
       </w:tblGrid>
       <w:tr>
         <w:tc>
           <w:tcPr>
-            <w:tcW w:type="dxa" w:w="2160"/>
+            <w:tcW w:type="dxa" w:w="2880"/>
             <w:shd w:val="clear" w:color="auto" w:fill="4472C4"/>
           </w:tcPr>
           <w:p>
@@ -120,13 +201,13 @@
                 <w:color w:val="FFFFFF"/>
                 <w:sz w:val="18"/>
               </w:rPr>
-              <w:t>위치</w:t>
+              <w:t>부스터</w:t>
             </w:r>
           </w:p>
         </w:tc>
         <w:tc>
           <w:tcPr>
-            <w:tcW w:type="dxa" w:w="2160"/>
+            <w:tcW w:type="dxa" w:w="2880"/>
             <w:shd w:val="clear" w:color="auto" w:fill="4472C4"/>
           </w:tcPr>
           <w:p>
@@ -139,13 +220,13 @@
                 <w:color w:val="FFFFFF"/>
                 <w:sz w:val="18"/>
               </w:rPr>
-              <w:t>트리거</w:t>
+              <w:t>코인 가치</w:t>
             </w:r>
           </w:p>
         </w:tc>
         <w:tc>
           <w:tcPr>
-            <w:tcW w:type="dxa" w:w="2160"/>
+            <w:tcW w:type="dxa" w:w="2880"/>
             <w:shd w:val="clear" w:color="auto" w:fill="4472C4"/>
           </w:tcPr>
           <w:p>
@@ -158,26 +239,7 @@
                 <w:color w:val="FFFFFF"/>
                 <w:sz w:val="18"/>
               </w:rPr>
-              <w:t>보상</w:t>
-            </w:r>
-          </w:p>
-        </w:tc>
-        <w:tc>
-          <w:tcPr>
-            <w:tcW w:type="dxa" w:w="2160"/>
-            <w:shd w:val="clear" w:color="auto" w:fill="4472C4"/>
-          </w:tcPr>
-          <w:p>
-            <w:pPr>
-              <w:jc w:val="center"/>
-            </w:pPr>
-            <w:r>
-              <w:rPr>
-                <w:b/>
-                <w:color w:val="FFFFFF"/>
-                <w:sz w:val="18"/>
-              </w:rPr>
-              <w:t>일일 제한</w:t>
+              <w:t>USD 가치</w:t>
             </w:r>
           </w:p>
         </w:tc>
@@ -185,53 +247,40 @@
       <w:tr>
         <w:tc>
           <w:tcPr>
-            <w:tcW w:type="dxa" w:w="2160"/>
+            <w:tcW w:type="dxa" w:w="2880"/>
           </w:tcPr>
           <w:p>
             <w:r>
               <w:rPr>
                 <w:sz w:val="18"/>
               </w:rPr>
-              <w:t>free_heart</w:t>
+              <w:t>tray_add</w:t>
             </w:r>
           </w:p>
         </w:tc>
         <w:tc>
           <w:tcPr>
-            <w:tcW w:type="dxa" w:w="2160"/>
+            <w:tcW w:type="dxa" w:w="2880"/>
           </w:tcPr>
           <w:p>
             <w:r>
               <w:rPr>
                 <w:sz w:val="18"/>
               </w:rPr>
-              <w:t>하트 소진 팝업</w:t>
+              <w:t>300</w:t>
             </w:r>
           </w:p>
         </w:tc>
         <w:tc>
           <w:tcPr>
-            <w:tcW w:type="dxa" w:w="2160"/>
+            <w:tcW w:type="dxa" w:w="2880"/>
           </w:tcPr>
           <w:p>
             <w:r>
               <w:rPr>
                 <w:sz w:val="18"/>
               </w:rPr>
-              <w:t>하트 1개</w:t>
-            </w:r>
-          </w:p>
-        </w:tc>
-        <w:tc>
-          <w:tcPr>
-            <w:tcW w:type="dxa" w:w="2160"/>
-          </w:tcPr>
-          <w:p>
-            <w:r>
-              <w:rPr>
-                <w:sz w:val="18"/>
-              </w:rPr>
-              <w:t>5</w:t>
+              <w:t>$0.33</w:t>
             </w:r>
           </w:p>
         </w:tc>
@@ -239,526 +288,20 @@
       <w:tr>
         <w:tc>
           <w:tcPr>
-            <w:tcW w:type="dxa" w:w="2160"/>
+            <w:tcW w:type="dxa" w:w="2880"/>
           </w:tcPr>
           <w:p>
             <w:r>
               <w:rPr>
                 <w:sz w:val="18"/>
               </w:rPr>
-              <w:t>free_continue</w:t>
+              <w:t>shuffle</w:t>
             </w:r>
           </w:p>
         </w:tc>
         <w:tc>
           <w:tcPr>
-            <w:tcW w:type="dxa" w:w="2160"/>
-          </w:tcPr>
-          <w:p>
-            <w:r>
-              <w:rPr>
-                <w:sz w:val="18"/>
-              </w:rPr>
-              <w:t>실패 팝업 (첫 번째)</w:t>
-            </w:r>
-          </w:p>
-        </w:tc>
-        <w:tc>
-          <w:tcPr>
-            <w:tcW w:type="dxa" w:w="2160"/>
-          </w:tcPr>
-          <w:p>
-            <w:r>
-              <w:rPr>
-                <w:sz w:val="18"/>
-              </w:rPr>
-              <w:t>다트 +5 이어하기</w:t>
-            </w:r>
-          </w:p>
-        </w:tc>
-        <w:tc>
-          <w:tcPr>
-            <w:tcW w:type="dxa" w:w="2160"/>
-          </w:tcPr>
-          <w:p>
-            <w:r>
-              <w:rPr>
-                <w:sz w:val="18"/>
-              </w:rPr>
-              <w:t>3</w:t>
-            </w:r>
-          </w:p>
-        </w:tc>
-      </w:tr>
-      <w:tr>
-        <w:tc>
-          <w:tcPr>
-            <w:tcW w:type="dxa" w:w="2160"/>
-          </w:tcPr>
-          <w:p>
-            <w:r>
-              <w:rPr>
-                <w:sz w:val="18"/>
-              </w:rPr>
-              <w:t>free_booster</w:t>
-            </w:r>
-          </w:p>
-        </w:tc>
-        <w:tc>
-          <w:tcPr>
-            <w:tcW w:type="dxa" w:w="2160"/>
-          </w:tcPr>
-          <w:p>
-            <w:r>
-              <w:rPr>
-                <w:sz w:val="18"/>
-              </w:rPr>
-              <w:t>레벨 시작 부스터 슬롯</w:t>
-            </w:r>
-          </w:p>
-        </w:tc>
-        <w:tc>
-          <w:tcPr>
-            <w:tcW w:type="dxa" w:w="2160"/>
-          </w:tcPr>
-          <w:p>
-            <w:r>
-              <w:rPr>
-                <w:sz w:val="18"/>
-              </w:rPr>
-              <w:t>랜덤 부스터 1개</w:t>
-            </w:r>
-          </w:p>
-        </w:tc>
-        <w:tc>
-          <w:tcPr>
-            <w:tcW w:type="dxa" w:w="2160"/>
-          </w:tcPr>
-          <w:p>
-            <w:r>
-              <w:rPr>
-                <w:sz w:val="18"/>
-              </w:rPr>
-              <w:t>3</w:t>
-            </w:r>
-          </w:p>
-        </w:tc>
-      </w:tr>
-      <w:tr>
-        <w:tc>
-          <w:tcPr>
-            <w:tcW w:type="dxa" w:w="2160"/>
-          </w:tcPr>
-          <w:p>
-            <w:r>
-              <w:rPr>
-                <w:sz w:val="18"/>
-              </w:rPr>
-              <w:t>double_reward</w:t>
-            </w:r>
-          </w:p>
-        </w:tc>
-        <w:tc>
-          <w:tcPr>
-            <w:tcW w:type="dxa" w:w="2160"/>
-          </w:tcPr>
-          <w:p>
-            <w:r>
-              <w:rPr>
-                <w:sz w:val="18"/>
-              </w:rPr>
-              <w:t>레벨 클리어 결과 화면</w:t>
-            </w:r>
-          </w:p>
-        </w:tc>
-        <w:tc>
-          <w:tcPr>
-            <w:tcW w:type="dxa" w:w="2160"/>
-          </w:tcPr>
-          <w:p>
-            <w:r>
-              <w:rPr>
-                <w:sz w:val="18"/>
-              </w:rPr>
-              <w:t>코인 보상 2배</w:t>
-            </w:r>
-          </w:p>
-        </w:tc>
-        <w:tc>
-          <w:tcPr>
-            <w:tcW w:type="dxa" w:w="2160"/>
-          </w:tcPr>
-          <w:p>
-            <w:r>
-              <w:rPr>
-                <w:sz w:val="18"/>
-              </w:rPr>
-              <w:t>10</w:t>
-            </w:r>
-          </w:p>
-        </w:tc>
-      </w:tr>
-      <w:tr>
-        <w:tc>
-          <w:tcPr>
-            <w:tcW w:type="dxa" w:w="2160"/>
-          </w:tcPr>
-          <w:p>
-            <w:r>
-              <w:rPr>
-                <w:sz w:val="18"/>
-              </w:rPr>
-              <w:t>free_coin</w:t>
-            </w:r>
-          </w:p>
-        </w:tc>
-        <w:tc>
-          <w:tcPr>
-            <w:tcW w:type="dxa" w:w="2160"/>
-          </w:tcPr>
-          <w:p>
-            <w:r>
-              <w:rPr>
-                <w:sz w:val="18"/>
-              </w:rPr>
-              <w:t>상점 버튼</w:t>
-            </w:r>
-          </w:p>
-        </w:tc>
-        <w:tc>
-          <w:tcPr>
-            <w:tcW w:type="dxa" w:w="2160"/>
-          </w:tcPr>
-          <w:p>
-            <w:r>
-              <w:rPr>
-                <w:sz w:val="18"/>
-              </w:rPr>
-              <w:t>코인 200</w:t>
-            </w:r>
-          </w:p>
-        </w:tc>
-        <w:tc>
-          <w:tcPr>
-            <w:tcW w:type="dxa" w:w="2160"/>
-          </w:tcPr>
-          <w:p>
-            <w:r>
-              <w:rPr>
-                <w:sz w:val="18"/>
-              </w:rPr>
-              <w:t>5</w:t>
-            </w:r>
-          </w:p>
-        </w:tc>
-      </w:tr>
-      <w:tr>
-        <w:tc>
-          <w:tcPr>
-            <w:tcW w:type="dxa" w:w="2160"/>
-          </w:tcPr>
-          <w:p>
-            <w:r>
-              <w:rPr>
-                <w:sz w:val="18"/>
-              </w:rPr>
-              <w:t>spin_wheel</w:t>
-            </w:r>
-          </w:p>
-        </w:tc>
-        <w:tc>
-          <w:tcPr>
-            <w:tcW w:type="dxa" w:w="2160"/>
-          </w:tcPr>
-          <w:p>
-            <w:r>
-              <w:rPr>
-                <w:sz w:val="18"/>
-              </w:rPr>
-              <w:t>일일 룰렛</w:t>
-            </w:r>
-          </w:p>
-        </w:tc>
-        <w:tc>
-          <w:tcPr>
-            <w:tcW w:type="dxa" w:w="2160"/>
-          </w:tcPr>
-          <w:p>
-            <w:r>
-              <w:rPr>
-                <w:sz w:val="18"/>
-              </w:rPr>
-              <w:t>랜덤 보상</w:t>
-            </w:r>
-          </w:p>
-        </w:tc>
-        <w:tc>
-          <w:tcPr>
-            <w:tcW w:type="dxa" w:w="2160"/>
-          </w:tcPr>
-          <w:p>
-            <w:r>
-              <w:rPr>
-                <w:sz w:val="18"/>
-              </w:rPr>
-              <w:t>3</w:t>
-            </w:r>
-          </w:p>
-        </w:tc>
-      </w:tr>
-    </w:tbl>
-    <w:p/>
-    <w:p>
-      <w:pPr>
-        <w:pStyle w:val="Heading1"/>
-      </w:pPr>
-      <w:r>
-        <w:t>3. 전면 광고</w:t>
-      </w:r>
-    </w:p>
-    <w:p>
-      <w:r>
-        <w:rPr>
-          <w:b/>
-          <w:sz w:val="20"/>
-        </w:rPr>
-        <w:t xml:space="preserve">기본 빈도: </w:t>
-      </w:r>
-      <w:r>
-        <w:rPr>
-          <w:sz w:val="20"/>
-        </w:rPr>
-        <w:t>매 3레벨 클리어 후 1회</w:t>
-      </w:r>
-    </w:p>
-    <w:p>
-      <w:r>
-        <w:rPr>
-          <w:b/>
-          <w:sz w:val="20"/>
-        </w:rPr>
-        <w:t xml:space="preserve">쿨다운: </w:t>
-      </w:r>
-      <w:r>
-        <w:rPr>
-          <w:sz w:val="20"/>
-        </w:rPr>
-        <w:t>최소 120초 간격</w:t>
-      </w:r>
-    </w:p>
-    <w:p>
-      <w:pPr>
-        <w:pStyle w:val="Heading2"/>
-      </w:pPr>
-      <w:r>
-        <w:t>스킵 조건</w:t>
-      </w:r>
-    </w:p>
-    <w:p>
-      <w:pPr>
-        <w:pStyle w:val="ListBullet"/>
-        <w:ind w:left="850"/>
-      </w:pPr>
-      <w:r>
-        <w:t>IAP 구매 이력 있는 유저 (광고 제거 미구매 시에도 빈도 50% 감소)</w:t>
-      </w:r>
-    </w:p>
-    <w:p>
-      <w:pPr>
-        <w:pStyle w:val="ListBullet"/>
-        <w:ind w:left="850"/>
-      </w:pPr>
-      <w:r>
-        <w:t>튜토리얼 레벨 (1~5)</w:t>
-      </w:r>
-    </w:p>
-    <w:p>
-      <w:pPr>
-        <w:pStyle w:val="ListBullet"/>
-        <w:ind w:left="850"/>
-      </w:pPr>
-      <w:r>
-        <w:t>첫 세션 15분 이내</w:t>
-      </w:r>
-    </w:p>
-    <w:p>
-      <w:pPr>
-        <w:pStyle w:val="Heading1"/>
-      </w:pPr>
-      <w:r>
-        <w:t>4. IAP 패키지</w:t>
-      </w:r>
-    </w:p>
-    <w:p>
-      <w:pPr>
-        <w:pStyle w:val="Heading2"/>
-      </w:pPr>
-      <w:r>
-        <w:t>4-1. 젬 팩</w:t>
-      </w:r>
-    </w:p>
-    <w:tbl>
-      <w:tblPr>
-        <w:tblStyle w:val="TableGrid"/>
-        <w:tblW w:type="auto" w:w="0"/>
-        <w:jc w:val="center"/>
-        <w:tblLook w:firstColumn="1" w:firstRow="1" w:lastColumn="0" w:lastRow="0" w:noHBand="0" w:noVBand="1" w:val="04A0"/>
-      </w:tblPr>
-      <w:tblGrid>
-        <w:gridCol w:w="2160"/>
-        <w:gridCol w:w="2160"/>
-        <w:gridCol w:w="2160"/>
-        <w:gridCol w:w="2160"/>
-      </w:tblGrid>
-      <w:tr>
-        <w:tc>
-          <w:tcPr>
-            <w:tcW w:type="dxa" w:w="2160"/>
-            <w:shd w:val="clear" w:color="auto" w:fill="4472C4"/>
-          </w:tcPr>
-          <w:p>
-            <w:pPr>
-              <w:jc w:val="center"/>
-            </w:pPr>
-            <w:r>
-              <w:rPr>
-                <w:b/>
-                <w:color w:val="FFFFFF"/>
-                <w:sz w:val="18"/>
-              </w:rPr>
-              <w:t>이름</w:t>
-            </w:r>
-          </w:p>
-        </w:tc>
-        <w:tc>
-          <w:tcPr>
-            <w:tcW w:type="dxa" w:w="2160"/>
-            <w:shd w:val="clear" w:color="auto" w:fill="4472C4"/>
-          </w:tcPr>
-          <w:p>
-            <w:pPr>
-              <w:jc w:val="center"/>
-            </w:pPr>
-            <w:r>
-              <w:rPr>
-                <w:b/>
-                <w:color w:val="FFFFFF"/>
-                <w:sz w:val="18"/>
-              </w:rPr>
-              <w:t>젬</w:t>
-            </w:r>
-          </w:p>
-        </w:tc>
-        <w:tc>
-          <w:tcPr>
-            <w:tcW w:type="dxa" w:w="2160"/>
-            <w:shd w:val="clear" w:color="auto" w:fill="4472C4"/>
-          </w:tcPr>
-          <w:p>
-            <w:pPr>
-              <w:jc w:val="center"/>
-            </w:pPr>
-            <w:r>
-              <w:rPr>
-                <w:b/>
-                <w:color w:val="FFFFFF"/>
-                <w:sz w:val="18"/>
-              </w:rPr>
-              <w:t>가격($)</w:t>
-            </w:r>
-          </w:p>
-        </w:tc>
-        <w:tc>
-          <w:tcPr>
-            <w:tcW w:type="dxa" w:w="2160"/>
-            <w:shd w:val="clear" w:color="auto" w:fill="4472C4"/>
-          </w:tcPr>
-          <w:p>
-            <w:pPr>
-              <w:jc w:val="center"/>
-            </w:pPr>
-            <w:r>
-              <w:rPr>
-                <w:b/>
-                <w:color w:val="FFFFFF"/>
-                <w:sz w:val="18"/>
-              </w:rPr>
-              <w:t>보너스</w:t>
-            </w:r>
-          </w:p>
-        </w:tc>
-      </w:tr>
-      <w:tr>
-        <w:tc>
-          <w:tcPr>
-            <w:tcW w:type="dxa" w:w="2160"/>
-          </w:tcPr>
-          <w:p>
-            <w:r>
-              <w:rPr>
-                <w:sz w:val="18"/>
-              </w:rPr>
-              <w:t>소량 젬</w:t>
-            </w:r>
-          </w:p>
-        </w:tc>
-        <w:tc>
-          <w:tcPr>
-            <w:tcW w:type="dxa" w:w="2160"/>
-          </w:tcPr>
-          <w:p>
-            <w:r>
-              <w:rPr>
-                <w:sz w:val="18"/>
-              </w:rPr>
-              <w:t>80</w:t>
-            </w:r>
-          </w:p>
-        </w:tc>
-        <w:tc>
-          <w:tcPr>
-            <w:tcW w:type="dxa" w:w="2160"/>
-          </w:tcPr>
-          <w:p>
-            <w:r>
-              <w:rPr>
-                <w:sz w:val="18"/>
-              </w:rPr>
-              <w:t>0.99</w:t>
-            </w:r>
-          </w:p>
-        </w:tc>
-        <w:tc>
-          <w:tcPr>
-            <w:tcW w:type="dxa" w:w="2160"/>
-          </w:tcPr>
-          <w:p>
-            <w:r>
-              <w:rPr>
-                <w:sz w:val="18"/>
-              </w:rPr>
-              <w:t>0</w:t>
-            </w:r>
-          </w:p>
-        </w:tc>
-      </w:tr>
-      <w:tr>
-        <w:tc>
-          <w:tcPr>
-            <w:tcW w:type="dxa" w:w="2160"/>
-          </w:tcPr>
-          <w:p>
-            <w:r>
-              <w:rPr>
-                <w:sz w:val="18"/>
-              </w:rPr>
-              <w:t>중간 젬</w:t>
-            </w:r>
-          </w:p>
-        </w:tc>
-        <w:tc>
-          <w:tcPr>
-            <w:tcW w:type="dxa" w:w="2160"/>
+            <w:tcW w:type="dxa" w:w="2880"/>
           </w:tcPr>
           <w:p>
             <w:r>
@@ -771,27 +314,14 @@
         </w:tc>
         <w:tc>
           <w:tcPr>
-            <w:tcW w:type="dxa" w:w="2160"/>
+            <w:tcW w:type="dxa" w:w="2880"/>
           </w:tcPr>
           <w:p>
             <w:r>
               <w:rPr>
                 <w:sz w:val="18"/>
               </w:rPr>
-              <w:t>4.99</w:t>
-            </w:r>
-          </w:p>
-        </w:tc>
-        <w:tc>
-          <w:tcPr>
-            <w:tcW w:type="dxa" w:w="2160"/>
-          </w:tcPr>
-          <w:p>
-            <w:r>
-              <w:rPr>
-                <w:sz w:val="18"/>
-              </w:rPr>
-              <w:t>50</w:t>
+              <w:t>$0.55</w:t>
             </w:r>
           </w:p>
         </w:tc>
@@ -799,53 +329,40 @@
       <w:tr>
         <w:tc>
           <w:tcPr>
-            <w:tcW w:type="dxa" w:w="2160"/>
+            <w:tcW w:type="dxa" w:w="2880"/>
           </w:tcPr>
           <w:p>
             <w:r>
               <w:rPr>
                 <w:sz w:val="18"/>
               </w:rPr>
-              <w:t>대량 젬</w:t>
+              <w:t>hand</w:t>
             </w:r>
           </w:p>
         </w:tc>
         <w:tc>
           <w:tcPr>
-            <w:tcW w:type="dxa" w:w="2160"/>
+            <w:tcW w:type="dxa" w:w="2880"/>
           </w:tcPr>
           <w:p>
             <w:r>
               <w:rPr>
                 <w:sz w:val="18"/>
               </w:rPr>
-              <w:t>1200</w:t>
+              <w:t>633</w:t>
             </w:r>
           </w:p>
         </w:tc>
         <w:tc>
           <w:tcPr>
-            <w:tcW w:type="dxa" w:w="2160"/>
+            <w:tcW w:type="dxa" w:w="2880"/>
           </w:tcPr>
           <w:p>
             <w:r>
               <w:rPr>
                 <w:sz w:val="18"/>
               </w:rPr>
-              <w:t>9.99</w:t>
-            </w:r>
-          </w:p>
-        </w:tc>
-        <w:tc>
-          <w:tcPr>
-            <w:tcW w:type="dxa" w:w="2160"/>
-          </w:tcPr>
-          <w:p>
-            <w:r>
-              <w:rPr>
-                <w:sz w:val="18"/>
-              </w:rPr>
-              <w:t>200</w:t>
+              <w:t>$0.7</w:t>
             </w:r>
           </w:p>
         </w:tc>
@@ -853,53 +370,40 @@
       <w:tr>
         <w:tc>
           <w:tcPr>
-            <w:tcW w:type="dxa" w:w="2160"/>
+            <w:tcW w:type="dxa" w:w="2880"/>
           </w:tcPr>
           <w:p>
             <w:r>
               <w:rPr>
                 <w:sz w:val="18"/>
               </w:rPr>
-              <w:t>메가 젬</w:t>
+              <w:t>color_remove</w:t>
             </w:r>
           </w:p>
         </w:tc>
         <w:tc>
           <w:tcPr>
-            <w:tcW w:type="dxa" w:w="2160"/>
+            <w:tcW w:type="dxa" w:w="2880"/>
           </w:tcPr>
           <w:p>
             <w:r>
               <w:rPr>
                 <w:sz w:val="18"/>
               </w:rPr>
-              <w:t>3000</w:t>
+              <w:t>967</w:t>
             </w:r>
           </w:p>
         </w:tc>
         <w:tc>
           <w:tcPr>
-            <w:tcW w:type="dxa" w:w="2160"/>
+            <w:tcW w:type="dxa" w:w="2880"/>
           </w:tcPr>
           <w:p>
             <w:r>
               <w:rPr>
                 <w:sz w:val="18"/>
               </w:rPr>
-              <w:t>19.99</w:t>
-            </w:r>
-          </w:p>
-        </w:tc>
-        <w:tc>
-          <w:tcPr>
-            <w:tcW w:type="dxa" w:w="2160"/>
-          </w:tcPr>
-          <w:p>
-            <w:r>
-              <w:rPr>
-                <w:sz w:val="18"/>
-              </w:rPr>
-              <w:t>800</w:t>
+              <w:t>$1.06</w:t>
             </w:r>
           </w:p>
         </w:tc>
@@ -907,671 +411,40 @@
       <w:tr>
         <w:tc>
           <w:tcPr>
-            <w:tcW w:type="dxa" w:w="2160"/>
+            <w:tcW w:type="dxa" w:w="2880"/>
           </w:tcPr>
           <w:p>
             <w:r>
               <w:rPr>
                 <w:sz w:val="18"/>
               </w:rPr>
-              <w:t>울트라 젬</w:t>
+              <w:t>set_of_4</w:t>
             </w:r>
           </w:p>
         </w:tc>
         <w:tc>
           <w:tcPr>
-            <w:tcW w:type="dxa" w:w="2160"/>
+            <w:tcW w:type="dxa" w:w="2880"/>
           </w:tcPr>
           <w:p>
             <w:r>
               <w:rPr>
                 <w:sz w:val="18"/>
               </w:rPr>
-              <w:t>8000</w:t>
+              <w:t>2400</w:t>
             </w:r>
           </w:p>
         </w:tc>
         <w:tc>
           <w:tcPr>
-            <w:tcW w:type="dxa" w:w="2160"/>
+            <w:tcW w:type="dxa" w:w="2880"/>
           </w:tcPr>
           <w:p>
             <w:r>
               <w:rPr>
                 <w:sz w:val="18"/>
               </w:rPr>
-              <w:t>49.99</w:t>
-            </w:r>
-          </w:p>
-        </w:tc>
-        <w:tc>
-          <w:tcPr>
-            <w:tcW w:type="dxa" w:w="2160"/>
-          </w:tcPr>
-          <w:p>
-            <w:r>
-              <w:rPr>
-                <w:sz w:val="18"/>
-              </w:rPr>
-              <w:t>3000</w:t>
-            </w:r>
-          </w:p>
-        </w:tc>
-      </w:tr>
-    </w:tbl>
-    <w:p/>
-    <w:p>
-      <w:pPr>
-        <w:pStyle w:val="Heading2"/>
-      </w:pPr>
-      <w:r>
-        <w:t>4-2. 특별 오퍼</w:t>
-      </w:r>
-    </w:p>
-    <w:tbl>
-      <w:tblPr>
-        <w:tblStyle w:val="TableGrid"/>
-        <w:tblW w:type="auto" w:w="0"/>
-        <w:jc w:val="center"/>
-        <w:tblLook w:firstColumn="1" w:firstRow="1" w:lastColumn="0" w:lastRow="0" w:noHBand="0" w:noVBand="1" w:val="04A0"/>
-      </w:tblPr>
-      <w:tblGrid>
-        <w:gridCol w:w="2160"/>
-        <w:gridCol w:w="2160"/>
-        <w:gridCol w:w="2160"/>
-        <w:gridCol w:w="2160"/>
-      </w:tblGrid>
-      <w:tr>
-        <w:tc>
-          <w:tcPr>
-            <w:tcW w:type="dxa" w:w="2160"/>
-            <w:shd w:val="clear" w:color="auto" w:fill="4472C4"/>
-          </w:tcPr>
-          <w:p>
-            <w:pPr>
-              <w:jc w:val="center"/>
-            </w:pPr>
-            <w:r>
-              <w:rPr>
-                <w:b/>
-                <w:color w:val="FFFFFF"/>
-                <w:sz w:val="18"/>
-              </w:rPr>
-              <w:t>이름</w:t>
-            </w:r>
-          </w:p>
-        </w:tc>
-        <w:tc>
-          <w:tcPr>
-            <w:tcW w:type="dxa" w:w="2160"/>
-            <w:shd w:val="clear" w:color="auto" w:fill="4472C4"/>
-          </w:tcPr>
-          <w:p>
-            <w:pPr>
-              <w:jc w:val="center"/>
-            </w:pPr>
-            <w:r>
-              <w:rPr>
-                <w:b/>
-                <w:color w:val="FFFFFF"/>
-                <w:sz w:val="18"/>
-              </w:rPr>
-              <w:t>가격($)</w:t>
-            </w:r>
-          </w:p>
-        </w:tc>
-        <w:tc>
-          <w:tcPr>
-            <w:tcW w:type="dxa" w:w="2160"/>
-            <w:shd w:val="clear" w:color="auto" w:fill="4472C4"/>
-          </w:tcPr>
-          <w:p>
-            <w:pPr>
-              <w:jc w:val="center"/>
-            </w:pPr>
-            <w:r>
-              <w:rPr>
-                <w:b/>
-                <w:color w:val="FFFFFF"/>
-                <w:sz w:val="18"/>
-              </w:rPr>
-              <w:t>트리거</w:t>
-            </w:r>
-          </w:p>
-        </w:tc>
-        <w:tc>
-          <w:tcPr>
-            <w:tcW w:type="dxa" w:w="2160"/>
-            <w:shd w:val="clear" w:color="auto" w:fill="4472C4"/>
-          </w:tcPr>
-          <w:p>
-            <w:pPr>
-              <w:jc w:val="center"/>
-            </w:pPr>
-            <w:r>
-              <w:rPr>
-                <w:b/>
-                <w:color w:val="FFFFFF"/>
-                <w:sz w:val="18"/>
-              </w:rPr>
-              <w:t>제한시간</w:t>
-            </w:r>
-          </w:p>
-        </w:tc>
-      </w:tr>
-      <w:tr>
-        <w:tc>
-          <w:tcPr>
-            <w:tcW w:type="dxa" w:w="2160"/>
-          </w:tcPr>
-          <w:p>
-            <w:r>
-              <w:rPr>
-                <w:sz w:val="18"/>
-              </w:rPr>
-              <w:t>스타터팩</w:t>
-            </w:r>
-          </w:p>
-        </w:tc>
-        <w:tc>
-          <w:tcPr>
-            <w:tcW w:type="dxa" w:w="2160"/>
-          </w:tcPr>
-          <w:p>
-            <w:r>
-              <w:rPr>
-                <w:sz w:val="18"/>
-              </w:rPr>
-              <w:t>1.99</w:t>
-            </w:r>
-          </w:p>
-        </w:tc>
-        <w:tc>
-          <w:tcPr>
-            <w:tcW w:type="dxa" w:w="2160"/>
-          </w:tcPr>
-          <w:p>
-            <w:r>
-              <w:rPr>
-                <w:sz w:val="18"/>
-              </w:rPr>
-              <w:t>Level 10</w:t>
-            </w:r>
-          </w:p>
-        </w:tc>
-        <w:tc>
-          <w:tcPr>
-            <w:tcW w:type="dxa" w:w="2160"/>
-          </w:tcPr>
-          <w:p>
-            <w:r>
-              <w:rPr>
-                <w:sz w:val="18"/>
-              </w:rPr>
-              <w:t>24h</w:t>
-            </w:r>
-          </w:p>
-        </w:tc>
-      </w:tr>
-      <w:tr>
-        <w:tc>
-          <w:tcPr>
-            <w:tcW w:type="dxa" w:w="2160"/>
-          </w:tcPr>
-          <w:p>
-            <w:r>
-              <w:rPr>
-                <w:sz w:val="18"/>
-              </w:rPr>
-              <w:t>레벨 팩</w:t>
-            </w:r>
-          </w:p>
-        </w:tc>
-        <w:tc>
-          <w:tcPr>
-            <w:tcW w:type="dxa" w:w="2160"/>
-          </w:tcPr>
-          <w:p>
-            <w:r>
-              <w:rPr>
-                <w:sz w:val="18"/>
-              </w:rPr>
-              <w:t>3.99</w:t>
-            </w:r>
-          </w:p>
-        </w:tc>
-        <w:tc>
-          <w:tcPr>
-            <w:tcW w:type="dxa" w:w="2160"/>
-          </w:tcPr>
-          <w:p>
-            <w:r>
-              <w:rPr>
-                <w:sz w:val="18"/>
-              </w:rPr>
-              <w:t>Level 50 실패 3회</w:t>
-            </w:r>
-          </w:p>
-        </w:tc>
-        <w:tc>
-          <w:tcPr>
-            <w:tcW w:type="dxa" w:w="2160"/>
-          </w:tcPr>
-          <w:p>
-            <w:r>
-              <w:rPr>
-                <w:sz w:val="18"/>
-              </w:rPr>
-              <w:t>6h</w:t>
-            </w:r>
-          </w:p>
-        </w:tc>
-      </w:tr>
-      <w:tr>
-        <w:tc>
-          <w:tcPr>
-            <w:tcW w:type="dxa" w:w="2160"/>
-          </w:tcPr>
-          <w:p>
-            <w:r>
-              <w:rPr>
-                <w:sz w:val="18"/>
-              </w:rPr>
-              <w:t>위크엔드 팩</w:t>
-            </w:r>
-          </w:p>
-        </w:tc>
-        <w:tc>
-          <w:tcPr>
-            <w:tcW w:type="dxa" w:w="2160"/>
-          </w:tcPr>
-          <w:p>
-            <w:r>
-              <w:rPr>
-                <w:sz w:val="18"/>
-              </w:rPr>
-              <w:t>2.99</w:t>
-            </w:r>
-          </w:p>
-        </w:tc>
-        <w:tc>
-          <w:tcPr>
-            <w:tcW w:type="dxa" w:w="2160"/>
-          </w:tcPr>
-          <w:p>
-            <w:r>
-              <w:rPr>
-                <w:sz w:val="18"/>
-              </w:rPr>
-              <w:t>주말 진입</w:t>
-            </w:r>
-          </w:p>
-        </w:tc>
-        <w:tc>
-          <w:tcPr>
-            <w:tcW w:type="dxa" w:w="2160"/>
-          </w:tcPr>
-          <w:p>
-            <w:r>
-              <w:rPr>
-                <w:sz w:val="18"/>
-              </w:rPr>
-              <w:t>48h</w:t>
-            </w:r>
-          </w:p>
-        </w:tc>
-      </w:tr>
-    </w:tbl>
-    <w:p/>
-    <w:p>
-      <w:pPr>
-        <w:pStyle w:val="Heading2"/>
-      </w:pPr>
-      <w:r>
-        <w:t>4-3. 광고 제거</w:t>
-      </w:r>
-    </w:p>
-    <w:p>
-      <w:r>
-        <w:rPr>
-          <w:b/>
-          <w:sz w:val="20"/>
-        </w:rPr>
-        <w:t xml:space="preserve">광고 제거: </w:t>
-      </w:r>
-      <w:r>
-        <w:rPr>
-          <w:sz w:val="20"/>
-        </w:rPr>
-        <w:t>$4.99 (non_consumable)</w:t>
-      </w:r>
-    </w:p>
-    <w:p>
-      <w:pPr>
-        <w:pStyle w:val="Heading1"/>
-      </w:pPr>
-      <w:r>
-        <w:t>5. 스타터팩</w:t>
-      </w:r>
-    </w:p>
-    <w:p>
-      <w:r>
-        <w:rPr>
-          <w:b/>
-          <w:sz w:val="20"/>
-        </w:rPr>
-        <w:t xml:space="preserve">가격: </w:t>
-      </w:r>
-      <w:r>
-        <w:rPr>
-          <w:sz w:val="20"/>
-        </w:rPr>
-        <w:t>$1.99</w:t>
-      </w:r>
-    </w:p>
-    <w:p>
-      <w:r>
-        <w:rPr>
-          <w:b/>
-          <w:sz w:val="20"/>
-        </w:rPr>
-        <w:t xml:space="preserve">해금 조건: </w:t>
-      </w:r>
-      <w:r>
-        <w:rPr>
-          <w:sz w:val="20"/>
-        </w:rPr>
-        <w:t>Level 10 클리어</w:t>
-      </w:r>
-    </w:p>
-    <w:p>
-      <w:r>
-        <w:rPr>
-          <w:b/>
-          <w:sz w:val="20"/>
-        </w:rPr>
-        <w:t xml:space="preserve">제한 시간: </w:t>
-      </w:r>
-      <w:r>
-        <w:rPr>
-          <w:sz w:val="20"/>
-        </w:rPr>
-        <w:t>24시간</w:t>
-      </w:r>
-    </w:p>
-    <w:p>
-      <w:r>
-        <w:rPr>
-          <w:b/>
-          <w:sz w:val="20"/>
-        </w:rPr>
-        <w:t xml:space="preserve">가치 배율: </w:t>
-      </w:r>
-      <w:r>
-        <w:rPr>
-          <w:sz w:val="20"/>
-        </w:rPr>
-        <w:t>5.0x</w:t>
-      </w:r>
-    </w:p>
-    <w:p>
-      <w:pPr>
-        <w:pStyle w:val="Heading2"/>
-      </w:pPr>
-      <w:r>
-        <w:t>구성품</w:t>
-      </w:r>
-    </w:p>
-    <w:p>
-      <w:pPr>
-        <w:pStyle w:val="ListBullet"/>
-        <w:ind w:left="850"/>
-      </w:pPr>
-      <w:r>
-        <w:t>젬 100개</w:t>
-      </w:r>
-    </w:p>
-    <w:p>
-      <w:pPr>
-        <w:pStyle w:val="ListBullet"/>
-        <w:ind w:left="850"/>
-      </w:pPr>
-      <w:r>
-        <w:t>부스터 팩 (Color Reveal x3, Extra Darts x3, Bomb Dart x3)</w:t>
-      </w:r>
-    </w:p>
-    <w:p>
-      <w:pPr>
-        <w:pStyle w:val="ListBullet"/>
-        <w:ind w:left="850"/>
-      </w:pPr>
-      <w:r>
-        <w:t>하트 풀 충전</w:t>
-      </w:r>
-    </w:p>
-    <w:p>
-      <w:pPr>
-        <w:pStyle w:val="Heading1"/>
-      </w:pPr>
-      <w:r>
-        <w:t>6. 피기뱅크</w:t>
-      </w:r>
-    </w:p>
-    <w:tbl>
-      <w:tblPr>
-        <w:tblStyle w:val="TableGrid"/>
-        <w:tblW w:type="auto" w:w="0"/>
-        <w:jc w:val="center"/>
-        <w:tblLook w:firstColumn="1" w:firstRow="1" w:lastColumn="0" w:lastRow="0" w:noHBand="0" w:noVBand="1" w:val="04A0"/>
-      </w:tblPr>
-      <w:tblGrid>
-        <w:gridCol w:w="4320"/>
-        <w:gridCol w:w="4320"/>
-      </w:tblGrid>
-      <w:tr>
-        <w:tc>
-          <w:tcPr>
-            <w:tcW w:type="dxa" w:w="4320"/>
-            <w:shd w:val="clear" w:color="auto" w:fill="4472C4"/>
-          </w:tcPr>
-          <w:p>
-            <w:pPr>
-              <w:jc w:val="center"/>
-            </w:pPr>
-            <w:r>
-              <w:rPr>
-                <w:b/>
-                <w:color w:val="FFFFFF"/>
-                <w:sz w:val="18"/>
-              </w:rPr>
-              <w:t>항목</w:t>
-            </w:r>
-          </w:p>
-        </w:tc>
-        <w:tc>
-          <w:tcPr>
-            <w:tcW w:type="dxa" w:w="4320"/>
-            <w:shd w:val="clear" w:color="auto" w:fill="4472C4"/>
-          </w:tcPr>
-          <w:p>
-            <w:pPr>
-              <w:jc w:val="center"/>
-            </w:pPr>
-            <w:r>
-              <w:rPr>
-                <w:b/>
-                <w:color w:val="FFFFFF"/>
-                <w:sz w:val="18"/>
-              </w:rPr>
-              <w:t>값</w:t>
-            </w:r>
-          </w:p>
-        </w:tc>
-      </w:tr>
-      <w:tr>
-        <w:tc>
-          <w:tcPr>
-            <w:tcW w:type="dxa" w:w="4320"/>
-          </w:tcPr>
-          <w:p>
-            <w:r>
-              <w:rPr>
-                <w:sz w:val="18"/>
-              </w:rPr>
-              <w:t>가격</w:t>
-            </w:r>
-          </w:p>
-        </w:tc>
-        <w:tc>
-          <w:tcPr>
-            <w:tcW w:type="dxa" w:w="4320"/>
-          </w:tcPr>
-          <w:p>
-            <w:r>
-              <w:rPr>
-                <w:sz w:val="18"/>
-              </w:rPr>
-              <w:t>$2.99</w:t>
-            </w:r>
-          </w:p>
-        </w:tc>
-      </w:tr>
-      <w:tr>
-        <w:tc>
-          <w:tcPr>
-            <w:tcW w:type="dxa" w:w="4320"/>
-          </w:tcPr>
-          <w:p>
-            <w:r>
-              <w:rPr>
-                <w:sz w:val="18"/>
-              </w:rPr>
-              <w:t>충전 주기</w:t>
-            </w:r>
-          </w:p>
-        </w:tc>
-        <w:tc>
-          <w:tcPr>
-            <w:tcW w:type="dxa" w:w="4320"/>
-          </w:tcPr>
-          <w:p>
-            <w:r>
-              <w:rPr>
-                <w:sz w:val="18"/>
-              </w:rPr>
-              <w:t>8판</w:t>
-            </w:r>
-          </w:p>
-        </w:tc>
-      </w:tr>
-      <w:tr>
-        <w:tc>
-          <w:tcPr>
-            <w:tcW w:type="dxa" w:w="4320"/>
-          </w:tcPr>
-          <w:p>
-            <w:r>
-              <w:rPr>
-                <w:sz w:val="18"/>
-              </w:rPr>
-              <w:t>보상 구성</w:t>
-            </w:r>
-          </w:p>
-        </w:tc>
-        <w:tc>
-          <w:tcPr>
-            <w:tcW w:type="dxa" w:w="4320"/>
-          </w:tcPr>
-          <w:p>
-            <w:r>
-              <w:rPr>
-                <w:sz w:val="18"/>
-              </w:rPr>
-              <w:t>100% 젬</w:t>
-            </w:r>
-          </w:p>
-        </w:tc>
-      </w:tr>
-      <w:tr>
-        <w:tc>
-          <w:tcPr>
-            <w:tcW w:type="dxa" w:w="4320"/>
-          </w:tcPr>
-          <w:p>
-            <w:r>
-              <w:rPr>
-                <w:sz w:val="18"/>
-              </w:rPr>
-              <w:t>가치 배율</w:t>
-            </w:r>
-          </w:p>
-        </w:tc>
-        <w:tc>
-          <w:tcPr>
-            <w:tcW w:type="dxa" w:w="4320"/>
-          </w:tcPr>
-          <w:p>
-            <w:r>
-              <w:rPr>
-                <w:sz w:val="18"/>
-              </w:rPr>
-              <w:t>2.5x</w:t>
-            </w:r>
-          </w:p>
-        </w:tc>
-      </w:tr>
-      <w:tr>
-        <w:tc>
-          <w:tcPr>
-            <w:tcW w:type="dxa" w:w="4320"/>
-          </w:tcPr>
-          <w:p>
-            <w:r>
-              <w:rPr>
-                <w:sz w:val="18"/>
-              </w:rPr>
-              <w:t>해금 조건</w:t>
-            </w:r>
-          </w:p>
-        </w:tc>
-        <w:tc>
-          <w:tcPr>
-            <w:tcW w:type="dxa" w:w="4320"/>
-          </w:tcPr>
-          <w:p>
-            <w:r>
-              <w:rPr>
-                <w:sz w:val="18"/>
-              </w:rPr>
-              <w:t>Level 20</w:t>
-            </w:r>
-          </w:p>
-        </w:tc>
-      </w:tr>
-      <w:tr>
-        <w:tc>
-          <w:tcPr>
-            <w:tcW w:type="dxa" w:w="4320"/>
-          </w:tcPr>
-          <w:p>
-            <w:r>
-              <w:rPr>
-                <w:sz w:val="18"/>
-              </w:rPr>
-              <w:t>시각 피드백</w:t>
-            </w:r>
-          </w:p>
-        </w:tc>
-        <w:tc>
-          <w:tcPr>
-            <w:tcW w:type="dxa" w:w="4320"/>
-          </w:tcPr>
-          <w:p>
-            <w:r>
-              <w:rPr>
-                <w:sz w:val="18"/>
-              </w:rPr>
-              <w:t>풍선 모양 피기뱅크가 점점 부풀어 오름</w:t>
+              <w:t>$2.64</w:t>
             </w:r>
           </w:p>
         </w:tc>
@@ -1583,840 +456,7 @@
         <w:pStyle w:val="Heading1"/>
       </w:pPr>
       <w:r>
-        <w:t>7. 시즌패스</w:t>
-      </w:r>
-    </w:p>
-    <w:p>
-      <w:r>
-        <w:rPr>
-          <w:b/>
-          <w:sz w:val="20"/>
-        </w:rPr>
-        <w:t xml:space="preserve">가격: </w:t>
-      </w:r>
-      <w:r>
-        <w:rPr>
-          <w:sz w:val="20"/>
-        </w:rPr>
-        <w:t>$4.99/시즌 (4.99주)</w:t>
-      </w:r>
-    </w:p>
-    <w:p>
-      <w:r>
-        <w:rPr>
-          <w:b/>
-          <w:sz w:val="20"/>
-        </w:rPr>
-        <w:t xml:space="preserve">무료 트랙: </w:t>
-      </w:r>
-      <w:r>
-        <w:rPr>
-          <w:sz w:val="20"/>
-        </w:rPr>
-        <w:t>코인, 기본 부스터</w:t>
-      </w:r>
-    </w:p>
-    <w:p>
-      <w:r>
-        <w:rPr>
-          <w:b/>
-          <w:sz w:val="20"/>
-        </w:rPr>
-        <w:t xml:space="preserve">프리미엄 트랙: </w:t>
-      </w:r>
-      <w:r>
-        <w:rPr>
-          <w:sz w:val="20"/>
-        </w:rPr>
-        <w:t>젬, 프리미엄 부스터, 한정 다트 스킨, 한정 풍선 스킨</w:t>
-      </w:r>
-    </w:p>
-    <w:p>
-      <w:r>
-        <w:rPr>
-          <w:b/>
-          <w:sz w:val="20"/>
-        </w:rPr>
-        <w:t xml:space="preserve">레벨 수: </w:t>
-      </w:r>
-      <w:r>
-        <w:rPr>
-          <w:sz w:val="20"/>
-        </w:rPr>
-        <w:t>30</w:t>
-      </w:r>
-    </w:p>
-    <w:p>
-      <w:r>
-        <w:rPr>
-          <w:b/>
-          <w:sz w:val="20"/>
-        </w:rPr>
-        <w:t xml:space="preserve">XP 소스: </w:t>
-      </w:r>
-      <w:r>
-        <w:rPr>
-          <w:sz w:val="20"/>
-        </w:rPr>
-        <w:t>레벨 클리어 = 10xp, 스타 = 5xp/개, 일일 퀘스트 = 30xp</w:t>
-      </w:r>
-    </w:p>
-    <w:p>
-      <w:pPr>
-        <w:pStyle w:val="Heading1"/>
-      </w:pPr>
-      <w:r>
-        <w:t>8. 부스터 시스템</w:t>
-      </w:r>
-    </w:p>
-    <w:p>
-      <w:pPr>
-        <w:pStyle w:val="Heading2"/>
-      </w:pPr>
-      <w:r>
-        <w:t>8-1. pre_play</w:t>
-      </w:r>
-    </w:p>
-    <w:tbl>
-      <w:tblPr>
-        <w:tblStyle w:val="TableGrid"/>
-        <w:tblW w:type="auto" w:w="0"/>
-        <w:jc w:val="center"/>
-        <w:tblLook w:firstColumn="1" w:firstRow="1" w:lastColumn="0" w:lastRow="0" w:noHBand="0" w:noVBand="1" w:val="04A0"/>
-      </w:tblPr>
-      <w:tblGrid>
-        <w:gridCol w:w="2160"/>
-        <w:gridCol w:w="2160"/>
-        <w:gridCol w:w="2160"/>
-        <w:gridCol w:w="2160"/>
-      </w:tblGrid>
-      <w:tr>
-        <w:tc>
-          <w:tcPr>
-            <w:tcW w:type="dxa" w:w="2160"/>
-            <w:shd w:val="clear" w:color="auto" w:fill="4472C4"/>
-          </w:tcPr>
-          <w:p>
-            <w:pPr>
-              <w:jc w:val="center"/>
-            </w:pPr>
-            <w:r>
-              <w:rPr>
-                <w:b/>
-                <w:color w:val="FFFFFF"/>
-                <w:sz w:val="18"/>
-              </w:rPr>
-              <w:t>ID</w:t>
-            </w:r>
-          </w:p>
-        </w:tc>
-        <w:tc>
-          <w:tcPr>
-            <w:tcW w:type="dxa" w:w="2160"/>
-            <w:shd w:val="clear" w:color="auto" w:fill="4472C4"/>
-          </w:tcPr>
-          <w:p>
-            <w:pPr>
-              <w:jc w:val="center"/>
-            </w:pPr>
-            <w:r>
-              <w:rPr>
-                <w:b/>
-                <w:color w:val="FFFFFF"/>
-                <w:sz w:val="18"/>
-              </w:rPr>
-              <w:t>이름</w:t>
-            </w:r>
-          </w:p>
-        </w:tc>
-        <w:tc>
-          <w:tcPr>
-            <w:tcW w:type="dxa" w:w="2160"/>
-            <w:shd w:val="clear" w:color="auto" w:fill="4472C4"/>
-          </w:tcPr>
-          <w:p>
-            <w:pPr>
-              <w:jc w:val="center"/>
-            </w:pPr>
-            <w:r>
-              <w:rPr>
-                <w:b/>
-                <w:color w:val="FFFFFF"/>
-                <w:sz w:val="18"/>
-              </w:rPr>
-              <w:t>설명</w:t>
-            </w:r>
-          </w:p>
-        </w:tc>
-        <w:tc>
-          <w:tcPr>
-            <w:tcW w:type="dxa" w:w="2160"/>
-            <w:shd w:val="clear" w:color="auto" w:fill="4472C4"/>
-          </w:tcPr>
-          <w:p>
-            <w:pPr>
-              <w:jc w:val="center"/>
-            </w:pPr>
-            <w:r>
-              <w:rPr>
-                <w:b/>
-                <w:color w:val="FFFFFF"/>
-                <w:sz w:val="18"/>
-              </w:rPr>
-              <w:t>비용</w:t>
-            </w:r>
-          </w:p>
-        </w:tc>
-      </w:tr>
-      <w:tr>
-        <w:tc>
-          <w:tcPr>
-            <w:tcW w:type="dxa" w:w="2160"/>
-          </w:tcPr>
-          <w:p>
-            <w:r>
-              <w:rPr>
-                <w:sz w:val="18"/>
-              </w:rPr>
-              <w:t>BF_PRE_01</w:t>
-            </w:r>
-          </w:p>
-        </w:tc>
-        <w:tc>
-          <w:tcPr>
-            <w:tcW w:type="dxa" w:w="2160"/>
-          </w:tcPr>
-          <w:p>
-            <w:r>
-              <w:rPr>
-                <w:sz w:val="18"/>
-              </w:rPr>
-              <w:t>Color Reveal</w:t>
-            </w:r>
-          </w:p>
-        </w:tc>
-        <w:tc>
-          <w:tcPr>
-            <w:tcW w:type="dxa" w:w="2160"/>
-          </w:tcPr>
-          <w:p>
-            <w:r>
-              <w:rPr>
-                <w:sz w:val="18"/>
-              </w:rPr>
-              <w:t>다음 다트 5개 색상 미리보기 (기본 3개 → 5개)</w:t>
-            </w:r>
-          </w:p>
-        </w:tc>
-        <w:tc>
-          <w:tcPr>
-            <w:tcW w:type="dxa" w:w="2160"/>
-          </w:tcPr>
-          <w:p>
-            <w:r>
-              <w:rPr>
-                <w:sz w:val="18"/>
-              </w:rPr>
-              <w:t>{'coin': 500}</w:t>
-            </w:r>
-          </w:p>
-        </w:tc>
-      </w:tr>
-      <w:tr>
-        <w:tc>
-          <w:tcPr>
-            <w:tcW w:type="dxa" w:w="2160"/>
-          </w:tcPr>
-          <w:p>
-            <w:r>
-              <w:rPr>
-                <w:sz w:val="18"/>
-              </w:rPr>
-              <w:t>BF_PRE_02</w:t>
-            </w:r>
-          </w:p>
-        </w:tc>
-        <w:tc>
-          <w:tcPr>
-            <w:tcW w:type="dxa" w:w="2160"/>
-          </w:tcPr>
-          <w:p>
-            <w:r>
-              <w:rPr>
-                <w:sz w:val="18"/>
-              </w:rPr>
-              <w:t>Extra Darts +5</w:t>
-            </w:r>
-          </w:p>
-        </w:tc>
-        <w:tc>
-          <w:tcPr>
-            <w:tcW w:type="dxa" w:w="2160"/>
-          </w:tcPr>
-          <w:p>
-            <w:r>
-              <w:rPr>
-                <w:sz w:val="18"/>
-              </w:rPr>
-              <w:t>시작 시 다트 5개 추가</w:t>
-            </w:r>
-          </w:p>
-        </w:tc>
-        <w:tc>
-          <w:tcPr>
-            <w:tcW w:type="dxa" w:w="2160"/>
-          </w:tcPr>
-          <w:p>
-            <w:r>
-              <w:rPr>
-                <w:sz w:val="18"/>
-              </w:rPr>
-              <w:t>{'coin': 800}</w:t>
-            </w:r>
-          </w:p>
-        </w:tc>
-      </w:tr>
-      <w:tr>
-        <w:tc>
-          <w:tcPr>
-            <w:tcW w:type="dxa" w:w="2160"/>
-          </w:tcPr>
-          <w:p>
-            <w:r>
-              <w:rPr>
-                <w:sz w:val="18"/>
-              </w:rPr>
-              <w:t>BF_PRE_03</w:t>
-            </w:r>
-          </w:p>
-        </w:tc>
-        <w:tc>
-          <w:tcPr>
-            <w:tcW w:type="dxa" w:w="2160"/>
-          </w:tcPr>
-          <w:p>
-            <w:r>
-              <w:rPr>
-                <w:sz w:val="18"/>
-              </w:rPr>
-              <w:t>Rail Freeze</w:t>
-            </w:r>
-          </w:p>
-        </w:tc>
-        <w:tc>
-          <w:tcPr>
-            <w:tcW w:type="dxa" w:w="2160"/>
-          </w:tcPr>
-          <w:p>
-            <w:r>
-              <w:rPr>
-                <w:sz w:val="18"/>
-              </w:rPr>
-              <w:t>시작 10초간 풍선 이동 정지</w:t>
-            </w:r>
-          </w:p>
-        </w:tc>
-        <w:tc>
-          <w:tcPr>
-            <w:tcW w:type="dxa" w:w="2160"/>
-          </w:tcPr>
-          <w:p>
-            <w:r>
-              <w:rPr>
-                <w:sz w:val="18"/>
-              </w:rPr>
-              <w:t>{'gem': 20}</w:t>
-            </w:r>
-          </w:p>
-        </w:tc>
-      </w:tr>
-    </w:tbl>
-    <w:p/>
-    <w:p>
-      <w:pPr>
-        <w:pStyle w:val="Heading2"/>
-      </w:pPr>
-      <w:r>
-        <w:t>8-2. in_play</w:t>
-      </w:r>
-    </w:p>
-    <w:tbl>
-      <w:tblPr>
-        <w:tblStyle w:val="TableGrid"/>
-        <w:tblW w:type="auto" w:w="0"/>
-        <w:jc w:val="center"/>
-        <w:tblLook w:firstColumn="1" w:firstRow="1" w:lastColumn="0" w:lastRow="0" w:noHBand="0" w:noVBand="1" w:val="04A0"/>
-      </w:tblPr>
-      <w:tblGrid>
-        <w:gridCol w:w="2160"/>
-        <w:gridCol w:w="2160"/>
-        <w:gridCol w:w="2160"/>
-        <w:gridCol w:w="2160"/>
-      </w:tblGrid>
-      <w:tr>
-        <w:tc>
-          <w:tcPr>
-            <w:tcW w:type="dxa" w:w="2160"/>
-            <w:shd w:val="clear" w:color="auto" w:fill="4472C4"/>
-          </w:tcPr>
-          <w:p>
-            <w:pPr>
-              <w:jc w:val="center"/>
-            </w:pPr>
-            <w:r>
-              <w:rPr>
-                <w:b/>
-                <w:color w:val="FFFFFF"/>
-                <w:sz w:val="18"/>
-              </w:rPr>
-              <w:t>ID</w:t>
-            </w:r>
-          </w:p>
-        </w:tc>
-        <w:tc>
-          <w:tcPr>
-            <w:tcW w:type="dxa" w:w="2160"/>
-            <w:shd w:val="clear" w:color="auto" w:fill="4472C4"/>
-          </w:tcPr>
-          <w:p>
-            <w:pPr>
-              <w:jc w:val="center"/>
-            </w:pPr>
-            <w:r>
-              <w:rPr>
-                <w:b/>
-                <w:color w:val="FFFFFF"/>
-                <w:sz w:val="18"/>
-              </w:rPr>
-              <w:t>이름</w:t>
-            </w:r>
-          </w:p>
-        </w:tc>
-        <w:tc>
-          <w:tcPr>
-            <w:tcW w:type="dxa" w:w="2160"/>
-            <w:shd w:val="clear" w:color="auto" w:fill="4472C4"/>
-          </w:tcPr>
-          <w:p>
-            <w:pPr>
-              <w:jc w:val="center"/>
-            </w:pPr>
-            <w:r>
-              <w:rPr>
-                <w:b/>
-                <w:color w:val="FFFFFF"/>
-                <w:sz w:val="18"/>
-              </w:rPr>
-              <w:t>설명</w:t>
-            </w:r>
-          </w:p>
-        </w:tc>
-        <w:tc>
-          <w:tcPr>
-            <w:tcW w:type="dxa" w:w="2160"/>
-            <w:shd w:val="clear" w:color="auto" w:fill="4472C4"/>
-          </w:tcPr>
-          <w:p>
-            <w:pPr>
-              <w:jc w:val="center"/>
-            </w:pPr>
-            <w:r>
-              <w:rPr>
-                <w:b/>
-                <w:color w:val="FFFFFF"/>
-                <w:sz w:val="18"/>
-              </w:rPr>
-              <w:t>비용</w:t>
-            </w:r>
-          </w:p>
-        </w:tc>
-      </w:tr>
-      <w:tr>
-        <w:tc>
-          <w:tcPr>
-            <w:tcW w:type="dxa" w:w="2160"/>
-          </w:tcPr>
-          <w:p>
-            <w:r>
-              <w:rPr>
-                <w:sz w:val="18"/>
-              </w:rPr>
-              <w:t>BF_IN_01</w:t>
-            </w:r>
-          </w:p>
-        </w:tc>
-        <w:tc>
-          <w:tcPr>
-            <w:tcW w:type="dxa" w:w="2160"/>
-          </w:tcPr>
-          <w:p>
-            <w:r>
-              <w:rPr>
-                <w:sz w:val="18"/>
-              </w:rPr>
-              <w:t>Bomb Dart</w:t>
-            </w:r>
-          </w:p>
-        </w:tc>
-        <w:tc>
-          <w:tcPr>
-            <w:tcW w:type="dxa" w:w="2160"/>
-          </w:tcPr>
-          <w:p>
-            <w:r>
-              <w:rPr>
-                <w:sz w:val="18"/>
-              </w:rPr>
-              <w:t>반경 2칸 범위 팝 다트 1개 생성</w:t>
-            </w:r>
-          </w:p>
-        </w:tc>
-        <w:tc>
-          <w:tcPr>
-            <w:tcW w:type="dxa" w:w="2160"/>
-          </w:tcPr>
-          <w:p>
-            <w:r>
-              <w:rPr>
-                <w:sz w:val="18"/>
-              </w:rPr>
-              <w:t>{'coin': 600}</w:t>
-            </w:r>
-          </w:p>
-        </w:tc>
-      </w:tr>
-      <w:tr>
-        <w:tc>
-          <w:tcPr>
-            <w:tcW w:type="dxa" w:w="2160"/>
-          </w:tcPr>
-          <w:p>
-            <w:r>
-              <w:rPr>
-                <w:sz w:val="18"/>
-              </w:rPr>
-              <w:t>BF_IN_02</w:t>
-            </w:r>
-          </w:p>
-        </w:tc>
-        <w:tc>
-          <w:tcPr>
-            <w:tcW w:type="dxa" w:w="2160"/>
-          </w:tcPr>
-          <w:p>
-            <w:r>
-              <w:rPr>
-                <w:sz w:val="18"/>
-              </w:rPr>
-              <w:t>Rainbow Dart</w:t>
-            </w:r>
-          </w:p>
-        </w:tc>
-        <w:tc>
-          <w:tcPr>
-            <w:tcW w:type="dxa" w:w="2160"/>
-          </w:tcPr>
-          <w:p>
-            <w:r>
-              <w:rPr>
-                <w:sz w:val="18"/>
-              </w:rPr>
-              <w:t>아무 색 풍선에 명중 가능한 다트 1개</w:t>
-            </w:r>
-          </w:p>
-        </w:tc>
-        <w:tc>
-          <w:tcPr>
-            <w:tcW w:type="dxa" w:w="2160"/>
-          </w:tcPr>
-          <w:p>
-            <w:r>
-              <w:rPr>
-                <w:sz w:val="18"/>
-              </w:rPr>
-              <w:t>{'coin': 700}</w:t>
-            </w:r>
-          </w:p>
-        </w:tc>
-      </w:tr>
-      <w:tr>
-        <w:tc>
-          <w:tcPr>
-            <w:tcW w:type="dxa" w:w="2160"/>
-          </w:tcPr>
-          <w:p>
-            <w:r>
-              <w:rPr>
-                <w:sz w:val="18"/>
-              </w:rPr>
-              <w:t>BF_IN_03</w:t>
-            </w:r>
-          </w:p>
-        </w:tc>
-        <w:tc>
-          <w:tcPr>
-            <w:tcW w:type="dxa" w:w="2160"/>
-          </w:tcPr>
-          <w:p>
-            <w:r>
-              <w:rPr>
-                <w:sz w:val="18"/>
-              </w:rPr>
-              <w:t>Shuffle Rail</w:t>
-            </w:r>
-          </w:p>
-        </w:tc>
-        <w:tc>
-          <w:tcPr>
-            <w:tcW w:type="dxa" w:w="2160"/>
-          </w:tcPr>
-          <w:p>
-            <w:r>
-              <w:rPr>
-                <w:sz w:val="18"/>
-              </w:rPr>
-              <w:t>레일 위 풍선 위치 무작위 재배치</w:t>
-            </w:r>
-          </w:p>
-        </w:tc>
-        <w:tc>
-          <w:tcPr>
-            <w:tcW w:type="dxa" w:w="2160"/>
-          </w:tcPr>
-          <w:p>
-            <w:r>
-              <w:rPr>
-                <w:sz w:val="18"/>
-              </w:rPr>
-              <w:t>{'gem': 15}</w:t>
-            </w:r>
-          </w:p>
-        </w:tc>
-      </w:tr>
-    </w:tbl>
-    <w:p/>
-    <w:p>
-      <w:pPr>
-        <w:pStyle w:val="Heading2"/>
-      </w:pPr>
-      <w:r>
-        <w:t>8-3. continue</w:t>
-      </w:r>
-    </w:p>
-    <w:tbl>
-      <w:tblPr>
-        <w:tblStyle w:val="TableGrid"/>
-        <w:tblW w:type="auto" w:w="0"/>
-        <w:jc w:val="center"/>
-        <w:tblLook w:firstColumn="1" w:firstRow="1" w:lastColumn="0" w:lastRow="0" w:noHBand="0" w:noVBand="1" w:val="04A0"/>
-      </w:tblPr>
-      <w:tblGrid>
-        <w:gridCol w:w="2160"/>
-        <w:gridCol w:w="2160"/>
-        <w:gridCol w:w="2160"/>
-        <w:gridCol w:w="2160"/>
-      </w:tblGrid>
-      <w:tr>
-        <w:tc>
-          <w:tcPr>
-            <w:tcW w:type="dxa" w:w="2160"/>
-            <w:shd w:val="clear" w:color="auto" w:fill="4472C4"/>
-          </w:tcPr>
-          <w:p>
-            <w:pPr>
-              <w:jc w:val="center"/>
-            </w:pPr>
-            <w:r>
-              <w:rPr>
-                <w:b/>
-                <w:color w:val="FFFFFF"/>
-                <w:sz w:val="18"/>
-              </w:rPr>
-              <w:t>ID</w:t>
-            </w:r>
-          </w:p>
-        </w:tc>
-        <w:tc>
-          <w:tcPr>
-            <w:tcW w:type="dxa" w:w="2160"/>
-            <w:shd w:val="clear" w:color="auto" w:fill="4472C4"/>
-          </w:tcPr>
-          <w:p>
-            <w:pPr>
-              <w:jc w:val="center"/>
-            </w:pPr>
-            <w:r>
-              <w:rPr>
-                <w:b/>
-                <w:color w:val="FFFFFF"/>
-                <w:sz w:val="18"/>
-              </w:rPr>
-              <w:t>이름</w:t>
-            </w:r>
-          </w:p>
-        </w:tc>
-        <w:tc>
-          <w:tcPr>
-            <w:tcW w:type="dxa" w:w="2160"/>
-            <w:shd w:val="clear" w:color="auto" w:fill="4472C4"/>
-          </w:tcPr>
-          <w:p>
-            <w:pPr>
-              <w:jc w:val="center"/>
-            </w:pPr>
-            <w:r>
-              <w:rPr>
-                <w:b/>
-                <w:color w:val="FFFFFF"/>
-                <w:sz w:val="18"/>
-              </w:rPr>
-              <w:t>설명</w:t>
-            </w:r>
-          </w:p>
-        </w:tc>
-        <w:tc>
-          <w:tcPr>
-            <w:tcW w:type="dxa" w:w="2160"/>
-            <w:shd w:val="clear" w:color="auto" w:fill="4472C4"/>
-          </w:tcPr>
-          <w:p>
-            <w:pPr>
-              <w:jc w:val="center"/>
-            </w:pPr>
-            <w:r>
-              <w:rPr>
-                <w:b/>
-                <w:color w:val="FFFFFF"/>
-                <w:sz w:val="18"/>
-              </w:rPr>
-              <w:t>비용</w:t>
-            </w:r>
-          </w:p>
-        </w:tc>
-      </w:tr>
-      <w:tr>
-        <w:tc>
-          <w:tcPr>
-            <w:tcW w:type="dxa" w:w="2160"/>
-          </w:tcPr>
-          <w:p>
-            <w:r>
-              <w:rPr>
-                <w:sz w:val="18"/>
-              </w:rPr>
-              <w:t>BF_CONT_01</w:t>
-            </w:r>
-          </w:p>
-        </w:tc>
-        <w:tc>
-          <w:tcPr>
-            <w:tcW w:type="dxa" w:w="2160"/>
-          </w:tcPr>
-          <w:p>
-            <w:r>
-              <w:rPr>
-                <w:sz w:val="18"/>
-              </w:rPr>
-              <w:t>Continue +5</w:t>
-            </w:r>
-          </w:p>
-        </w:tc>
-        <w:tc>
-          <w:tcPr>
-            <w:tcW w:type="dxa" w:w="2160"/>
-          </w:tcPr>
-          <w:p>
-            <w:r>
-              <w:rPr>
-                <w:sz w:val="18"/>
-              </w:rPr>
-              <w:t>실패 후 다트 5개 추가하여 이어하기</w:t>
-            </w:r>
-          </w:p>
-        </w:tc>
-        <w:tc>
-          <w:tcPr>
-            <w:tcW w:type="dxa" w:w="2160"/>
-          </w:tcPr>
-          <w:p>
-            <w:r>
-              <w:rPr>
-                <w:sz w:val="18"/>
-              </w:rPr>
-              <w:t>{'gem': 30}</w:t>
-            </w:r>
-          </w:p>
-        </w:tc>
-      </w:tr>
-    </w:tbl>
-    <w:p/>
-    <w:p>
-      <w:pPr>
-        <w:pStyle w:val="Heading1"/>
-      </w:pPr>
-      <w:r>
-        <w:t>9. 재화 구조</w:t>
-      </w:r>
-    </w:p>
-    <w:p>
-      <w:r>
-        <w:rPr>
-          <w:b/>
-          <w:sz w:val="20"/>
-        </w:rPr>
-        <w:t xml:space="preserve">코인 (coin): </w:t>
-      </w:r>
-      <w:r>
-        <w:rPr>
-          <w:sz w:val="20"/>
-        </w:rPr>
-        <w:t>기본 재화. 부스터 구매, 일부 꾸미기에 사용</w:t>
-      </w:r>
-    </w:p>
-    <w:p>
-      <w:r>
-        <w:rPr>
-          <w:b/>
-          <w:sz w:val="20"/>
-        </w:rPr>
-        <w:t xml:space="preserve">젬 (gem): </w:t>
-      </w:r>
-      <w:r>
-        <w:rPr>
-          <w:sz w:val="20"/>
-        </w:rPr>
-        <w:t>프리미엄 재화. 하트 충전, 고급 부스터, 컨티뉴에 사용</w:t>
-      </w:r>
-    </w:p>
-    <w:p>
-      <w:pPr>
-        <w:pStyle w:val="Heading1"/>
-      </w:pPr>
-      <w:r>
-        <w:t>10. 라이브 운영 계획</w:t>
-      </w:r>
-    </w:p>
-    <w:p>
-      <w:r>
-        <w:rPr>
-          <w:b/>
-          <w:sz w:val="20"/>
-        </w:rPr>
-        <w:t xml:space="preserve">시즌 주기: </w:t>
-      </w:r>
-      <w:r>
-        <w:rPr>
-          <w:sz w:val="20"/>
-        </w:rPr>
-        <w:t>4주</w:t>
-      </w:r>
-    </w:p>
-    <w:p>
-      <w:pPr>
-        <w:pStyle w:val="Heading2"/>
-      </w:pPr>
-      <w:r>
-        <w:t>10-1. 이벤트 캘린더</w:t>
+        <w:t>3. 표준 코인 상품 (6 Tiers)</w:t>
       </w:r>
     </w:p>
     <w:tbl>
@@ -2449,7 +489,7 @@
                 <w:color w:val="FFFFFF"/>
                 <w:sz w:val="18"/>
               </w:rPr>
-              <w:t>주기</w:t>
+              <w:t>가격($)</w:t>
             </w:r>
           </w:p>
         </w:tc>
@@ -2468,7 +508,7 @@
                 <w:color w:val="FFFFFF"/>
                 <w:sz w:val="18"/>
               </w:rPr>
-              <w:t>이름</w:t>
+              <w:t>상품명</w:t>
             </w:r>
           </w:p>
         </w:tc>
@@ -2487,7 +527,7 @@
                 <w:color w:val="FFFFFF"/>
                 <w:sz w:val="18"/>
               </w:rPr>
-              <w:t>타입</w:t>
+              <w:t>코인</w:t>
             </w:r>
           </w:p>
         </w:tc>
@@ -2506,7 +546,7 @@
                 <w:color w:val="FFFFFF"/>
                 <w:sz w:val="18"/>
               </w:rPr>
-              <w:t>기간</w:t>
+              <w:t>효율</w:t>
             </w:r>
           </w:p>
         </w:tc>
@@ -2525,7 +565,7 @@
                 <w:color w:val="FFFFFF"/>
                 <w:sz w:val="18"/>
               </w:rPr>
-              <w:t>보상</w:t>
+              <w:t>이어하기 환산</w:t>
             </w:r>
           </w:p>
         </w:tc>
@@ -2540,7 +580,7 @@
               <w:rPr>
                 <w:sz w:val="18"/>
               </w:rPr>
-              <w:t>weekly</w:t>
+              <w:t>0.99</w:t>
             </w:r>
           </w:p>
         </w:tc>
@@ -2553,7 +593,7 @@
               <w:rPr>
                 <w:sz w:val="18"/>
               </w:rPr>
-              <w:t>주간 랭킹</w:t>
+              <w:t>Standard Coin T1</w:t>
             </w:r>
           </w:p>
         </w:tc>
@@ -2566,7 +606,7 @@
               <w:rPr>
                 <w:sz w:val="18"/>
               </w:rPr>
-              <w:t>competitive</w:t>
+              <w:t>900</w:t>
             </w:r>
           </w:p>
         </w:tc>
@@ -2579,7 +619,7 @@
               <w:rPr>
                 <w:sz w:val="18"/>
               </w:rPr>
-              <w:t>7일</w:t>
+              <w:t>1.0x</w:t>
             </w:r>
           </w:p>
         </w:tc>
@@ -2592,7 +632,7 @@
               <w:rPr>
                 <w:sz w:val="18"/>
               </w:rPr>
-              <w:t>젬 + 뱃지</w:t>
+              <w:t>1.0</w:t>
             </w:r>
           </w:p>
         </w:tc>
@@ -2607,7 +647,7 @@
               <w:rPr>
                 <w:sz w:val="18"/>
               </w:rPr>
-              <w:t>weekly</w:t>
+              <w:t>2.99</w:t>
             </w:r>
           </w:p>
         </w:tc>
@@ -2620,7 +660,7 @@
               <w:rPr>
                 <w:sz w:val="18"/>
               </w:rPr>
-              <w:t>일일 퀘스트</w:t>
+              <w:t>Standard Coin T2</w:t>
             </w:r>
           </w:p>
         </w:tc>
@@ -2633,7 +673,7 @@
               <w:rPr>
                 <w:sz w:val="18"/>
               </w:rPr>
-              <w:t>daily</w:t>
+              <w:t>3600</w:t>
             </w:r>
           </w:p>
         </w:tc>
@@ -2646,7 +686,7 @@
               <w:rPr>
                 <w:sz w:val="18"/>
               </w:rPr>
-              <w:t>24시간</w:t>
+              <w:t>1.32x</w:t>
             </w:r>
           </w:p>
         </w:tc>
@@ -2659,7 +699,7 @@
               <w:rPr>
                 <w:sz w:val="18"/>
               </w:rPr>
-              <w:t>코인 + 부스터</w:t>
+              <w:t>4.0</w:t>
             </w:r>
           </w:p>
         </w:tc>
@@ -2674,7 +714,7 @@
               <w:rPr>
                 <w:sz w:val="18"/>
               </w:rPr>
-              <w:t>biweekly</w:t>
+              <w:t>4.99</w:t>
             </w:r>
           </w:p>
         </w:tc>
@@ -2687,7 +727,7 @@
               <w:rPr>
                 <w:sz w:val="18"/>
               </w:rPr>
-              <w:t>테마 이벤트</w:t>
+              <w:t>Standard Coin T3</w:t>
             </w:r>
           </w:p>
         </w:tc>
@@ -2700,7 +740,7 @@
               <w:rPr>
                 <w:sz w:val="18"/>
               </w:rPr>
-              <w:t>collection</w:t>
+              <w:t>6750</w:t>
             </w:r>
           </w:p>
         </w:tc>
@@ -2713,7 +753,7 @@
               <w:rPr>
                 <w:sz w:val="18"/>
               </w:rPr>
-              <w:t>14일</w:t>
+              <w:t>1.49x</w:t>
             </w:r>
           </w:p>
         </w:tc>
@@ -2726,7 +766,7 @@
               <w:rPr>
                 <w:sz w:val="18"/>
               </w:rPr>
-              <w:t>한정 스킨 + 젬</w:t>
+              <w:t>7.5</w:t>
             </w:r>
           </w:p>
         </w:tc>
@@ -2741,7 +781,7 @@
               <w:rPr>
                 <w:sz w:val="18"/>
               </w:rPr>
-              <w:t>monthly</w:t>
+              <w:t>9.99</w:t>
             </w:r>
           </w:p>
         </w:tc>
@@ -2754,7 +794,7 @@
               <w:rPr>
                 <w:sz w:val="18"/>
               </w:rPr>
-              <w:t>시즌 챌린지</w:t>
+              <w:t>Standard Coin T4</w:t>
             </w:r>
           </w:p>
         </w:tc>
@@ -2767,7 +807,7 @@
               <w:rPr>
                 <w:sz w:val="18"/>
               </w:rPr>
-              <w:t>season_pass</w:t>
+              <w:t>14400</w:t>
             </w:r>
           </w:p>
         </w:tc>
@@ -2780,7 +820,7 @@
               <w:rPr>
                 <w:sz w:val="18"/>
               </w:rPr>
-              <w:t>28일</w:t>
+              <w:t>1.59x</w:t>
             </w:r>
           </w:p>
         </w:tc>
@@ -2793,7 +833,7 @@
               <w:rPr>
                 <w:sz w:val="18"/>
               </w:rPr>
-              <w:t>프리미엄 트랙 보상</w:t>
+              <w:t>16.0</w:t>
             </w:r>
           </w:p>
         </w:tc>
@@ -2808,7 +848,7 @@
               <w:rPr>
                 <w:sz w:val="18"/>
               </w:rPr>
-              <w:t>special</w:t>
+              <w:t>19.99</w:t>
             </w:r>
           </w:p>
         </w:tc>
@@ -2821,7 +861,7 @@
               <w:rPr>
                 <w:sz w:val="18"/>
               </w:rPr>
-              <w:t>런칭 이벤트</w:t>
+              <w:t>Standard Coin T5</w:t>
             </w:r>
           </w:p>
         </w:tc>
@@ -2834,7 +874,7 @@
               <w:rPr>
                 <w:sz w:val="18"/>
               </w:rPr>
-              <w:t>limited</w:t>
+              <w:t>31500</w:t>
             </w:r>
           </w:p>
         </w:tc>
@@ -2847,7 +887,7 @@
               <w:rPr>
                 <w:sz w:val="18"/>
               </w:rPr>
-              <w:t>7일</w:t>
+              <w:t>1.73x</w:t>
             </w:r>
           </w:p>
         </w:tc>
@@ -2860,7 +900,7 @@
               <w:rPr>
                 <w:sz w:val="18"/>
               </w:rPr>
-              <w:t>한정 다트 스킨 + 젬 100</w:t>
+              <w:t>35.0</w:t>
             </w:r>
           </w:p>
         </w:tc>
@@ -2875,7 +915,7 @@
               <w:rPr>
                 <w:sz w:val="18"/>
               </w:rPr>
-              <w:t>special</w:t>
+              <w:t>99.99</w:t>
             </w:r>
           </w:p>
         </w:tc>
@@ -2888,7 +928,7 @@
               <w:rPr>
                 <w:sz w:val="18"/>
               </w:rPr>
-              <w:t>명절 이벤트</w:t>
+              <w:t>Standard Coin T6</w:t>
             </w:r>
           </w:p>
         </w:tc>
@@ -2901,7 +941,7 @@
               <w:rPr>
                 <w:sz w:val="18"/>
               </w:rPr>
-              <w:t>holiday</w:t>
+              <w:t>180000</w:t>
             </w:r>
           </w:p>
         </w:tc>
@@ -2914,7 +954,7 @@
               <w:rPr>
                 <w:sz w:val="18"/>
               </w:rPr>
-              <w:t>10일</w:t>
+              <w:t>1.98x</w:t>
             </w:r>
           </w:p>
         </w:tc>
@@ -2927,7 +967,7 @@
               <w:rPr>
                 <w:sz w:val="18"/>
               </w:rPr>
-              <w:t>테마 풍선 + 특별 레벨</w:t>
+              <w:t>200.0</w:t>
             </w:r>
           </w:p>
         </w:tc>
@@ -2936,10 +976,1379 @@
     <w:p/>
     <w:p>
       <w:pPr>
+        <w:pStyle w:val="Heading1"/>
+      </w:pPr>
+      <w:r>
+        <w:t>4. 표준 번들 상품 (5 Tiers)</w:t>
+      </w:r>
+    </w:p>
+    <w:tbl>
+      <w:tblPr>
+        <w:tblStyle w:val="TableGrid"/>
+        <w:tblW w:type="auto" w:w="0"/>
+        <w:jc w:val="center"/>
+        <w:tblLook w:firstColumn="1" w:firstRow="1" w:lastColumn="0" w:lastRow="0" w:noHBand="0" w:noVBand="1" w:val="04A0"/>
+      </w:tblPr>
+      <w:tblGrid>
+        <w:gridCol w:w="1440"/>
+        <w:gridCol w:w="1440"/>
+        <w:gridCol w:w="1440"/>
+        <w:gridCol w:w="1440"/>
+        <w:gridCol w:w="1440"/>
+        <w:gridCol w:w="1440"/>
+      </w:tblGrid>
+      <w:tr>
+        <w:tc>
+          <w:tcPr>
+            <w:tcW w:type="dxa" w:w="1440"/>
+            <w:shd w:val="clear" w:color="auto" w:fill="4472C4"/>
+          </w:tcPr>
+          <w:p>
+            <w:pPr>
+              <w:jc w:val="center"/>
+            </w:pPr>
+            <w:r>
+              <w:rPr>
+                <w:b/>
+                <w:color w:val="FFFFFF"/>
+                <w:sz w:val="18"/>
+              </w:rPr>
+              <w:t>가격($)</w:t>
+            </w:r>
+          </w:p>
+        </w:tc>
+        <w:tc>
+          <w:tcPr>
+            <w:tcW w:type="dxa" w:w="1440"/>
+            <w:shd w:val="clear" w:color="auto" w:fill="4472C4"/>
+          </w:tcPr>
+          <w:p>
+            <w:pPr>
+              <w:jc w:val="center"/>
+            </w:pPr>
+            <w:r>
+              <w:rPr>
+                <w:b/>
+                <w:color w:val="FFFFFF"/>
+                <w:sz w:val="18"/>
+              </w:rPr>
+              <w:t>상품명</w:t>
+            </w:r>
+          </w:p>
+        </w:tc>
+        <w:tc>
+          <w:tcPr>
+            <w:tcW w:type="dxa" w:w="1440"/>
+            <w:shd w:val="clear" w:color="auto" w:fill="4472C4"/>
+          </w:tcPr>
+          <w:p>
+            <w:pPr>
+              <w:jc w:val="center"/>
+            </w:pPr>
+            <w:r>
+              <w:rPr>
+                <w:b/>
+                <w:color w:val="FFFFFF"/>
+                <w:sz w:val="18"/>
+              </w:rPr>
+              <w:t>코인</w:t>
+            </w:r>
+          </w:p>
+        </w:tc>
+        <w:tc>
+          <w:tcPr>
+            <w:tcW w:type="dxa" w:w="1440"/>
+            <w:shd w:val="clear" w:color="auto" w:fill="4472C4"/>
+          </w:tcPr>
+          <w:p>
+            <w:pPr>
+              <w:jc w:val="center"/>
+            </w:pPr>
+            <w:r>
+              <w:rPr>
+                <w:b/>
+                <w:color w:val="FFFFFF"/>
+                <w:sz w:val="18"/>
+              </w:rPr>
+              <w:t>부스터</w:t>
+            </w:r>
+          </w:p>
+        </w:tc>
+        <w:tc>
+          <w:tcPr>
+            <w:tcW w:type="dxa" w:w="1440"/>
+            <w:shd w:val="clear" w:color="auto" w:fill="4472C4"/>
+          </w:tcPr>
+          <w:p>
+            <w:pPr>
+              <w:jc w:val="center"/>
+            </w:pPr>
+            <w:r>
+              <w:rPr>
+                <w:b/>
+                <w:color w:val="FFFFFF"/>
+                <w:sz w:val="18"/>
+              </w:rPr>
+              <w:t>효율</w:t>
+            </w:r>
+          </w:p>
+        </w:tc>
+        <w:tc>
+          <w:tcPr>
+            <w:tcW w:type="dxa" w:w="1440"/>
+            <w:shd w:val="clear" w:color="auto" w:fill="4472C4"/>
+          </w:tcPr>
+          <w:p>
+            <w:pPr>
+              <w:jc w:val="center"/>
+            </w:pPr>
+            <w:r>
+              <w:rPr>
+                <w:b/>
+                <w:color w:val="FFFFFF"/>
+                <w:sz w:val="18"/>
+              </w:rPr>
+              <w:t>이어하기 환산</w:t>
+            </w:r>
+          </w:p>
+        </w:tc>
+      </w:tr>
+      <w:tr>
+        <w:tc>
+          <w:tcPr>
+            <w:tcW w:type="dxa" w:w="1440"/>
+          </w:tcPr>
+          <w:p>
+            <w:r>
+              <w:rPr>
+                <w:sz w:val="18"/>
+              </w:rPr>
+              <w:t>4.99</w:t>
+            </w:r>
+          </w:p>
+        </w:tc>
+        <w:tc>
+          <w:tcPr>
+            <w:tcW w:type="dxa" w:w="1440"/>
+          </w:tcPr>
+          <w:p>
+            <w:r>
+              <w:rPr>
+                <w:sz w:val="18"/>
+              </w:rPr>
+              <w:t>Standard Bundle T1</w:t>
+            </w:r>
+          </w:p>
+        </w:tc>
+        <w:tc>
+          <w:tcPr>
+            <w:tcW w:type="dxa" w:w="1440"/>
+          </w:tcPr>
+          <w:p>
+            <w:r>
+              <w:rPr>
+                <w:sz w:val="18"/>
+              </w:rPr>
+              <w:t>5400</w:t>
+            </w:r>
+          </w:p>
+        </w:tc>
+        <w:tc>
+          <w:tcPr>
+            <w:tcW w:type="dxa" w:w="1440"/>
+          </w:tcPr>
+          <w:p>
+            <w:r>
+              <w:rPr>
+                <w:sz w:val="18"/>
+              </w:rPr>
+              <w:t>부스터 4종 각 1개</w:t>
+            </w:r>
+          </w:p>
+        </w:tc>
+        <w:tc>
+          <w:tcPr>
+            <w:tcW w:type="dxa" w:w="1440"/>
+          </w:tcPr>
+          <w:p>
+            <w:r>
+              <w:rPr>
+                <w:sz w:val="18"/>
+              </w:rPr>
+              <w:t>1.72x</w:t>
+            </w:r>
+          </w:p>
+        </w:tc>
+        <w:tc>
+          <w:tcPr>
+            <w:tcW w:type="dxa" w:w="1440"/>
+          </w:tcPr>
+          <w:p>
+            <w:r>
+              <w:rPr>
+                <w:sz w:val="18"/>
+              </w:rPr>
+              <w:t>6.0</w:t>
+            </w:r>
+          </w:p>
+        </w:tc>
+      </w:tr>
+      <w:tr>
+        <w:tc>
+          <w:tcPr>
+            <w:tcW w:type="dxa" w:w="1440"/>
+          </w:tcPr>
+          <w:p>
+            <w:r>
+              <w:rPr>
+                <w:sz w:val="18"/>
+              </w:rPr>
+              <w:t>9.99</w:t>
+            </w:r>
+          </w:p>
+        </w:tc>
+        <w:tc>
+          <w:tcPr>
+            <w:tcW w:type="dxa" w:w="1440"/>
+          </w:tcPr>
+          <w:p>
+            <w:r>
+              <w:rPr>
+                <w:sz w:val="18"/>
+              </w:rPr>
+              <w:t>Standard Bundle T2</w:t>
+            </w:r>
+          </w:p>
+        </w:tc>
+        <w:tc>
+          <w:tcPr>
+            <w:tcW w:type="dxa" w:w="1440"/>
+          </w:tcPr>
+          <w:p>
+            <w:r>
+              <w:rPr>
+                <w:sz w:val="18"/>
+              </w:rPr>
+              <w:t>10800</w:t>
+            </w:r>
+          </w:p>
+        </w:tc>
+        <w:tc>
+          <w:tcPr>
+            <w:tcW w:type="dxa" w:w="1440"/>
+          </w:tcPr>
+          <w:p>
+            <w:r>
+              <w:rPr>
+                <w:sz w:val="18"/>
+              </w:rPr>
+              <w:t>부스터 4종 각 2개</w:t>
+            </w:r>
+          </w:p>
+        </w:tc>
+        <w:tc>
+          <w:tcPr>
+            <w:tcW w:type="dxa" w:w="1440"/>
+          </w:tcPr>
+          <w:p>
+            <w:r>
+              <w:rPr>
+                <w:sz w:val="18"/>
+              </w:rPr>
+              <w:t>1.72x</w:t>
+            </w:r>
+          </w:p>
+        </w:tc>
+        <w:tc>
+          <w:tcPr>
+            <w:tcW w:type="dxa" w:w="1440"/>
+          </w:tcPr>
+          <w:p>
+            <w:r>
+              <w:rPr>
+                <w:sz w:val="18"/>
+              </w:rPr>
+              <w:t>12.0</w:t>
+            </w:r>
+          </w:p>
+        </w:tc>
+      </w:tr>
+      <w:tr>
+        <w:tc>
+          <w:tcPr>
+            <w:tcW w:type="dxa" w:w="1440"/>
+          </w:tcPr>
+          <w:p>
+            <w:r>
+              <w:rPr>
+                <w:sz w:val="18"/>
+              </w:rPr>
+              <w:t>19.99</w:t>
+            </w:r>
+          </w:p>
+        </w:tc>
+        <w:tc>
+          <w:tcPr>
+            <w:tcW w:type="dxa" w:w="1440"/>
+          </w:tcPr>
+          <w:p>
+            <w:r>
+              <w:rPr>
+                <w:sz w:val="18"/>
+              </w:rPr>
+              <w:t>Standard Bundle T3</w:t>
+            </w:r>
+          </w:p>
+        </w:tc>
+        <w:tc>
+          <w:tcPr>
+            <w:tcW w:type="dxa" w:w="1440"/>
+          </w:tcPr>
+          <w:p>
+            <w:r>
+              <w:rPr>
+                <w:sz w:val="18"/>
+              </w:rPr>
+              <w:t>22500</w:t>
+            </w:r>
+          </w:p>
+        </w:tc>
+        <w:tc>
+          <w:tcPr>
+            <w:tcW w:type="dxa" w:w="1440"/>
+          </w:tcPr>
+          <w:p>
+            <w:r>
+              <w:rPr>
+                <w:sz w:val="18"/>
+              </w:rPr>
+              <w:t>부스터 4종 각 4개</w:t>
+            </w:r>
+          </w:p>
+        </w:tc>
+        <w:tc>
+          <w:tcPr>
+            <w:tcW w:type="dxa" w:w="1440"/>
+          </w:tcPr>
+          <w:p>
+            <w:r>
+              <w:rPr>
+                <w:sz w:val="18"/>
+              </w:rPr>
+              <w:t>1.77x</w:t>
+            </w:r>
+          </w:p>
+        </w:tc>
+        <w:tc>
+          <w:tcPr>
+            <w:tcW w:type="dxa" w:w="1440"/>
+          </w:tcPr>
+          <w:p>
+            <w:r>
+              <w:rPr>
+                <w:sz w:val="18"/>
+              </w:rPr>
+              <w:t>25.0</w:t>
+            </w:r>
+          </w:p>
+        </w:tc>
+      </w:tr>
+      <w:tr>
+        <w:tc>
+          <w:tcPr>
+            <w:tcW w:type="dxa" w:w="1440"/>
+          </w:tcPr>
+          <w:p>
+            <w:r>
+              <w:rPr>
+                <w:sz w:val="18"/>
+              </w:rPr>
+              <w:t>49.99</w:t>
+            </w:r>
+          </w:p>
+        </w:tc>
+        <w:tc>
+          <w:tcPr>
+            <w:tcW w:type="dxa" w:w="1440"/>
+          </w:tcPr>
+          <w:p>
+            <w:r>
+              <w:rPr>
+                <w:sz w:val="18"/>
+              </w:rPr>
+              <w:t>Standard Bundle T4</w:t>
+            </w:r>
+          </w:p>
+        </w:tc>
+        <w:tc>
+          <w:tcPr>
+            <w:tcW w:type="dxa" w:w="1440"/>
+          </w:tcPr>
+          <w:p>
+            <w:r>
+              <w:rPr>
+                <w:sz w:val="18"/>
+              </w:rPr>
+              <w:t>63000</w:t>
+            </w:r>
+          </w:p>
+        </w:tc>
+        <w:tc>
+          <w:tcPr>
+            <w:tcW w:type="dxa" w:w="1440"/>
+          </w:tcPr>
+          <w:p>
+            <w:r>
+              <w:rPr>
+                <w:sz w:val="18"/>
+              </w:rPr>
+              <w:t>부스터 4종 각 10개</w:t>
+            </w:r>
+          </w:p>
+        </w:tc>
+        <w:tc>
+          <w:tcPr>
+            <w:tcW w:type="dxa" w:w="1440"/>
+          </w:tcPr>
+          <w:p>
+            <w:r>
+              <w:rPr>
+                <w:sz w:val="18"/>
+              </w:rPr>
+              <w:t>1.91x</w:t>
+            </w:r>
+          </w:p>
+        </w:tc>
+        <w:tc>
+          <w:tcPr>
+            <w:tcW w:type="dxa" w:w="1440"/>
+          </w:tcPr>
+          <w:p>
+            <w:r>
+              <w:rPr>
+                <w:sz w:val="18"/>
+              </w:rPr>
+              <w:t>70.0</w:t>
+            </w:r>
+          </w:p>
+        </w:tc>
+      </w:tr>
+      <w:tr>
+        <w:tc>
+          <w:tcPr>
+            <w:tcW w:type="dxa" w:w="1440"/>
+          </w:tcPr>
+          <w:p>
+            <w:r>
+              <w:rPr>
+                <w:sz w:val="18"/>
+              </w:rPr>
+              <w:t>99.99</w:t>
+            </w:r>
+          </w:p>
+        </w:tc>
+        <w:tc>
+          <w:tcPr>
+            <w:tcW w:type="dxa" w:w="1440"/>
+          </w:tcPr>
+          <w:p>
+            <w:r>
+              <w:rPr>
+                <w:sz w:val="18"/>
+              </w:rPr>
+              <w:t>Standard Bundle T5</w:t>
+            </w:r>
+          </w:p>
+        </w:tc>
+        <w:tc>
+          <w:tcPr>
+            <w:tcW w:type="dxa" w:w="1440"/>
+          </w:tcPr>
+          <w:p>
+            <w:r>
+              <w:rPr>
+                <w:sz w:val="18"/>
+              </w:rPr>
+              <w:t>135000</w:t>
+            </w:r>
+          </w:p>
+        </w:tc>
+        <w:tc>
+          <w:tcPr>
+            <w:tcW w:type="dxa" w:w="1440"/>
+          </w:tcPr>
+          <w:p>
+            <w:r>
+              <w:rPr>
+                <w:sz w:val="18"/>
+              </w:rPr>
+              <w:t>부스터 4종 각 20개</w:t>
+            </w:r>
+          </w:p>
+        </w:tc>
+        <w:tc>
+          <w:tcPr>
+            <w:tcW w:type="dxa" w:w="1440"/>
+          </w:tcPr>
+          <w:p>
+            <w:r>
+              <w:rPr>
+                <w:sz w:val="18"/>
+              </w:rPr>
+              <w:t>2.01x</w:t>
+            </w:r>
+          </w:p>
+        </w:tc>
+        <w:tc>
+          <w:tcPr>
+            <w:tcW w:type="dxa" w:w="1440"/>
+          </w:tcPr>
+          <w:p>
+            <w:r>
+              <w:rPr>
+                <w:sz w:val="18"/>
+              </w:rPr>
+              <w:t>150.0</w:t>
+            </w:r>
+          </w:p>
+        </w:tc>
+      </w:tr>
+    </w:tbl>
+    <w:p/>
+    <w:p>
+      <w:pPr>
+        <w:pStyle w:val="Heading1"/>
+      </w:pPr>
+      <w:r>
+        <w:t>5. 스타터팩</w:t>
+      </w:r>
+    </w:p>
+    <w:p>
+      <w:r>
+        <w:rPr>
+          <w:b/>
+          <w:sz w:val="20"/>
+        </w:rPr>
+        <w:t xml:space="preserve">목적: </w:t>
+      </w:r>
+      <w:r>
+        <w:rPr>
+          <w:sz w:val="20"/>
+        </w:rPr>
+        <w:t>첫 결제 장벽을 낮추는 것이 목적</w:t>
+      </w:r>
+    </w:p>
+    <w:p>
+      <w:r>
+        <w:rPr>
+          <w:b/>
+          <w:sz w:val="20"/>
+        </w:rPr>
+        <w:t xml:space="preserve">해금: </w:t>
+      </w:r>
+      <w:r>
+        <w:rPr>
+          <w:sz w:val="20"/>
+        </w:rPr>
+        <w:t>Lv.10~20 (피어 분석 후 확정)</w:t>
+      </w:r>
+    </w:p>
+    <w:p>
+      <w:r>
+        <w:rPr>
+          <w:b/>
+          <w:sz w:val="20"/>
+        </w:rPr>
+        <w:t xml:space="preserve">구매 제한: </w:t>
+      </w:r>
+      <w:r>
+        <w:rPr>
+          <w:sz w:val="20"/>
+        </w:rPr>
+        <w:t>1회 한정</w:t>
+      </w:r>
+    </w:p>
+    <w:tbl>
+      <w:tblPr>
+        <w:tblStyle w:val="TableGrid"/>
+        <w:tblW w:type="auto" w:w="0"/>
+        <w:jc w:val="center"/>
+        <w:tblLook w:firstColumn="1" w:firstRow="1" w:lastColumn="0" w:lastRow="0" w:noHBand="0" w:noVBand="1" w:val="04A0"/>
+      </w:tblPr>
+      <w:tblGrid>
+        <w:gridCol w:w="1440"/>
+        <w:gridCol w:w="1440"/>
+        <w:gridCol w:w="1440"/>
+        <w:gridCol w:w="1440"/>
+        <w:gridCol w:w="1440"/>
+        <w:gridCol w:w="1440"/>
+      </w:tblGrid>
+      <w:tr>
+        <w:tc>
+          <w:tcPr>
+            <w:tcW w:type="dxa" w:w="1440"/>
+            <w:shd w:val="clear" w:color="auto" w:fill="4472C4"/>
+          </w:tcPr>
+          <w:p>
+            <w:pPr>
+              <w:jc w:val="center"/>
+            </w:pPr>
+            <w:r>
+              <w:rPr>
+                <w:b/>
+                <w:color w:val="FFFFFF"/>
+                <w:sz w:val="18"/>
+              </w:rPr>
+              <w:t>가격($)</w:t>
+            </w:r>
+          </w:p>
+        </w:tc>
+        <w:tc>
+          <w:tcPr>
+            <w:tcW w:type="dxa" w:w="1440"/>
+            <w:shd w:val="clear" w:color="auto" w:fill="4472C4"/>
+          </w:tcPr>
+          <w:p>
+            <w:pPr>
+              <w:jc w:val="center"/>
+            </w:pPr>
+            <w:r>
+              <w:rPr>
+                <w:b/>
+                <w:color w:val="FFFFFF"/>
+                <w:sz w:val="18"/>
+              </w:rPr>
+              <w:t>상품명</w:t>
+            </w:r>
+          </w:p>
+        </w:tc>
+        <w:tc>
+          <w:tcPr>
+            <w:tcW w:type="dxa" w:w="1440"/>
+            <w:shd w:val="clear" w:color="auto" w:fill="4472C4"/>
+          </w:tcPr>
+          <w:p>
+            <w:pPr>
+              <w:jc w:val="center"/>
+            </w:pPr>
+            <w:r>
+              <w:rPr>
+                <w:b/>
+                <w:color w:val="FFFFFF"/>
+                <w:sz w:val="18"/>
+              </w:rPr>
+              <w:t>코인</w:t>
+            </w:r>
+          </w:p>
+        </w:tc>
+        <w:tc>
+          <w:tcPr>
+            <w:tcW w:type="dxa" w:w="1440"/>
+            <w:shd w:val="clear" w:color="auto" w:fill="4472C4"/>
+          </w:tcPr>
+          <w:p>
+            <w:pPr>
+              <w:jc w:val="center"/>
+            </w:pPr>
+            <w:r>
+              <w:rPr>
+                <w:b/>
+                <w:color w:val="FFFFFF"/>
+                <w:sz w:val="18"/>
+              </w:rPr>
+              <w:t>부스터</w:t>
+            </w:r>
+          </w:p>
+        </w:tc>
+        <w:tc>
+          <w:tcPr>
+            <w:tcW w:type="dxa" w:w="1440"/>
+            <w:shd w:val="clear" w:color="auto" w:fill="4472C4"/>
+          </w:tcPr>
+          <w:p>
+            <w:pPr>
+              <w:jc w:val="center"/>
+            </w:pPr>
+            <w:r>
+              <w:rPr>
+                <w:b/>
+                <w:color w:val="FFFFFF"/>
+                <w:sz w:val="18"/>
+              </w:rPr>
+              <w:t>효율</w:t>
+            </w:r>
+          </w:p>
+        </w:tc>
+        <w:tc>
+          <w:tcPr>
+            <w:tcW w:type="dxa" w:w="1440"/>
+            <w:shd w:val="clear" w:color="auto" w:fill="4472C4"/>
+          </w:tcPr>
+          <w:p>
+            <w:pPr>
+              <w:jc w:val="center"/>
+            </w:pPr>
+            <w:r>
+              <w:rPr>
+                <w:b/>
+                <w:color w:val="FFFFFF"/>
+                <w:sz w:val="18"/>
+              </w:rPr>
+              <w:t>이어하기 환산</w:t>
+            </w:r>
+          </w:p>
+        </w:tc>
+      </w:tr>
+      <w:tr>
+        <w:tc>
+          <w:tcPr>
+            <w:tcW w:type="dxa" w:w="1440"/>
+          </w:tcPr>
+          <w:p>
+            <w:r>
+              <w:rPr>
+                <w:sz w:val="18"/>
+              </w:rPr>
+              <w:t>0.99</w:t>
+            </w:r>
+          </w:p>
+        </w:tc>
+        <w:tc>
+          <w:tcPr>
+            <w:tcW w:type="dxa" w:w="1440"/>
+          </w:tcPr>
+          <w:p>
+            <w:r>
+              <w:rPr>
+                <w:sz w:val="18"/>
+              </w:rPr>
+              <w:t>스타터팩 I</w:t>
+            </w:r>
+          </w:p>
+        </w:tc>
+        <w:tc>
+          <w:tcPr>
+            <w:tcW w:type="dxa" w:w="1440"/>
+          </w:tcPr>
+          <w:p>
+            <w:r>
+              <w:rPr>
+                <w:sz w:val="18"/>
+              </w:rPr>
+              <w:t>900</w:t>
+            </w:r>
+          </w:p>
+        </w:tc>
+        <w:tc>
+          <w:tcPr>
+            <w:tcW w:type="dxa" w:w="1440"/>
+          </w:tcPr>
+          <w:p>
+            <w:r>
+              <w:rPr>
+                <w:sz w:val="18"/>
+              </w:rPr>
+              <w:t>부스터 4종 각 1개</w:t>
+            </w:r>
+          </w:p>
+        </w:tc>
+        <w:tc>
+          <w:tcPr>
+            <w:tcW w:type="dxa" w:w="1440"/>
+          </w:tcPr>
+          <w:p>
+            <w:r>
+              <w:rPr>
+                <w:sz w:val="18"/>
+              </w:rPr>
+              <w:t>3.67x</w:t>
+            </w:r>
+          </w:p>
+        </w:tc>
+        <w:tc>
+          <w:tcPr>
+            <w:tcW w:type="dxa" w:w="1440"/>
+          </w:tcPr>
+          <w:p>
+            <w:r>
+              <w:rPr>
+                <w:sz w:val="18"/>
+              </w:rPr>
+              <w:t>1.0</w:t>
+            </w:r>
+          </w:p>
+        </w:tc>
+      </w:tr>
+      <w:tr>
+        <w:tc>
+          <w:tcPr>
+            <w:tcW w:type="dxa" w:w="1440"/>
+          </w:tcPr>
+          <w:p>
+            <w:r>
+              <w:rPr>
+                <w:sz w:val="18"/>
+              </w:rPr>
+              <w:t>1.99</w:t>
+            </w:r>
+          </w:p>
+        </w:tc>
+        <w:tc>
+          <w:tcPr>
+            <w:tcW w:type="dxa" w:w="1440"/>
+          </w:tcPr>
+          <w:p>
+            <w:r>
+              <w:rPr>
+                <w:sz w:val="18"/>
+              </w:rPr>
+              <w:t>스타터팩 II</w:t>
+            </w:r>
+          </w:p>
+        </w:tc>
+        <w:tc>
+          <w:tcPr>
+            <w:tcW w:type="dxa" w:w="1440"/>
+          </w:tcPr>
+          <w:p>
+            <w:r>
+              <w:rPr>
+                <w:sz w:val="18"/>
+              </w:rPr>
+              <w:t>1800</w:t>
+            </w:r>
+          </w:p>
+        </w:tc>
+        <w:tc>
+          <w:tcPr>
+            <w:tcW w:type="dxa" w:w="1440"/>
+          </w:tcPr>
+          <w:p>
+            <w:r>
+              <w:rPr>
+                <w:sz w:val="18"/>
+              </w:rPr>
+              <w:t>부스터 4종 각 2개</w:t>
+            </w:r>
+          </w:p>
+        </w:tc>
+        <w:tc>
+          <w:tcPr>
+            <w:tcW w:type="dxa" w:w="1440"/>
+          </w:tcPr>
+          <w:p>
+            <w:r>
+              <w:rPr>
+                <w:sz w:val="18"/>
+              </w:rPr>
+              <w:t>3.65x</w:t>
+            </w:r>
+          </w:p>
+        </w:tc>
+        <w:tc>
+          <w:tcPr>
+            <w:tcW w:type="dxa" w:w="1440"/>
+          </w:tcPr>
+          <w:p>
+            <w:r>
+              <w:rPr>
+                <w:sz w:val="18"/>
+              </w:rPr>
+              <w:t>2.0</w:t>
+            </w:r>
+          </w:p>
+        </w:tc>
+      </w:tr>
+    </w:tbl>
+    <w:p/>
+    <w:p>
+      <w:pPr>
+        <w:pStyle w:val="Heading1"/>
+      </w:pPr>
+      <w:r>
+        <w:t>6. 광고 제거</w:t>
+      </w:r>
+    </w:p>
+    <w:p>
+      <w:r>
+        <w:rPr>
+          <w:b/>
+          <w:sz w:val="20"/>
+        </w:rPr>
+        <w:t xml:space="preserve">가격: </w:t>
+      </w:r>
+      <w:r>
+        <w:rPr>
+          <w:sz w:val="20"/>
+        </w:rPr>
+        <w:t>2.99~4.99 (피어 분석 후 확정)</w:t>
+      </w:r>
+    </w:p>
+    <w:p>
+      <w:r>
+        <w:rPr>
+          <w:b/>
+          <w:sz w:val="20"/>
+        </w:rPr>
+        <w:t xml:space="preserve">효과: </w:t>
+      </w:r>
+      <w:r>
+        <w:rPr>
+          <w:sz w:val="20"/>
+        </w:rPr>
+        <w:t>전면 광고 영구 제거 (보상형 광고는 유저 선택이므로 유지)</w:t>
+      </w:r>
+    </w:p>
+    <w:p>
+      <w:pPr>
+        <w:pStyle w:val="Heading1"/>
+      </w:pPr>
+      <w:r>
+        <w:t>7. 상품 간 가치 위계</w:t>
+      </w:r>
+    </w:p>
+    <w:tbl>
+      <w:tblPr>
+        <w:tblStyle w:val="TableGrid"/>
+        <w:tblW w:type="auto" w:w="0"/>
+        <w:jc w:val="center"/>
+        <w:tblLook w:firstColumn="1" w:firstRow="1" w:lastColumn="0" w:lastRow="0" w:noHBand="0" w:noVBand="1" w:val="04A0"/>
+      </w:tblPr>
+      <w:tblGrid>
+        <w:gridCol w:w="2880"/>
+        <w:gridCol w:w="2880"/>
+        <w:gridCol w:w="2880"/>
+      </w:tblGrid>
+      <w:tr>
+        <w:tc>
+          <w:tcPr>
+            <w:tcW w:type="dxa" w:w="2880"/>
+            <w:shd w:val="clear" w:color="auto" w:fill="4472C4"/>
+          </w:tcPr>
+          <w:p>
+            <w:pPr>
+              <w:jc w:val="center"/>
+            </w:pPr>
+            <w:r>
+              <w:rPr>
+                <w:b/>
+                <w:color w:val="FFFFFF"/>
+                <w:sz w:val="18"/>
+              </w:rPr>
+              <w:t>카테고리</w:t>
+            </w:r>
+          </w:p>
+        </w:tc>
+        <w:tc>
+          <w:tcPr>
+            <w:tcW w:type="dxa" w:w="2880"/>
+            <w:shd w:val="clear" w:color="auto" w:fill="4472C4"/>
+          </w:tcPr>
+          <w:p>
+            <w:pPr>
+              <w:jc w:val="center"/>
+            </w:pPr>
+            <w:r>
+              <w:rPr>
+                <w:b/>
+                <w:color w:val="FFFFFF"/>
+                <w:sz w:val="18"/>
+              </w:rPr>
+              <w:t>효율</w:t>
+            </w:r>
+          </w:p>
+        </w:tc>
+        <w:tc>
+          <w:tcPr>
+            <w:tcW w:type="dxa" w:w="2880"/>
+            <w:shd w:val="clear" w:color="auto" w:fill="4472C4"/>
+          </w:tcPr>
+          <w:p>
+            <w:pPr>
+              <w:jc w:val="center"/>
+            </w:pPr>
+            <w:r>
+              <w:rPr>
+                <w:b/>
+                <w:color w:val="FFFFFF"/>
+                <w:sz w:val="18"/>
+              </w:rPr>
+              <w:t>비고</w:t>
+            </w:r>
+          </w:p>
+        </w:tc>
+      </w:tr>
+      <w:tr>
+        <w:tc>
+          <w:tcPr>
+            <w:tcW w:type="dxa" w:w="2880"/>
+          </w:tcPr>
+          <w:p>
+            <w:r>
+              <w:rPr>
+                <w:sz w:val="18"/>
+              </w:rPr>
+              <w:t>스타터팩</w:t>
+            </w:r>
+          </w:p>
+        </w:tc>
+        <w:tc>
+          <w:tcPr>
+            <w:tcW w:type="dxa" w:w="2880"/>
+          </w:tcPr>
+          <w:p>
+            <w:r>
+              <w:rPr>
+                <w:sz w:val="18"/>
+              </w:rPr>
+              <w:t>3.0x+</w:t>
+            </w:r>
+          </w:p>
+        </w:tc>
+        <w:tc>
+          <w:tcPr>
+            <w:tcW w:type="dxa" w:w="2880"/>
+          </w:tcPr>
+          <w:p>
+            <w:r>
+              <w:rPr>
+                <w:sz w:val="18"/>
+              </w:rPr>
+              <w:t>1회 한정이라 최고 효율 허용</w:t>
+            </w:r>
+          </w:p>
+        </w:tc>
+      </w:tr>
+      <w:tr>
+        <w:tc>
+          <w:tcPr>
+            <w:tcW w:type="dxa" w:w="2880"/>
+          </w:tcPr>
+          <w:p>
+            <w:r>
+              <w:rPr>
+                <w:sz w:val="18"/>
+              </w:rPr>
+              <w:t>번들</w:t>
+            </w:r>
+          </w:p>
+        </w:tc>
+        <w:tc>
+          <w:tcPr>
+            <w:tcW w:type="dxa" w:w="2880"/>
+          </w:tcPr>
+          <w:p>
+            <w:r>
+              <w:rPr>
+                <w:sz w:val="18"/>
+              </w:rPr>
+              <w:t>1.7x~2.5x</w:t>
+            </w:r>
+          </w:p>
+        </w:tc>
+        <w:tc>
+          <w:tcPr>
+            <w:tcW w:type="dxa" w:w="2880"/>
+          </w:tcPr>
+          <w:p>
+            <w:r>
+              <w:rPr>
+                <w:sz w:val="18"/>
+              </w:rPr>
+              <w:t>코인 상품보다 항상 높아야 함</w:t>
+            </w:r>
+          </w:p>
+        </w:tc>
+      </w:tr>
+      <w:tr>
+        <w:tc>
+          <w:tcPr>
+            <w:tcW w:type="dxa" w:w="2880"/>
+          </w:tcPr>
+          <w:p>
+            <w:r>
+              <w:rPr>
+                <w:sz w:val="18"/>
+              </w:rPr>
+              <w:t>코인</w:t>
+            </w:r>
+          </w:p>
+        </w:tc>
+        <w:tc>
+          <w:tcPr>
+            <w:tcW w:type="dxa" w:w="2880"/>
+          </w:tcPr>
+          <w:p>
+            <w:r>
+              <w:rPr>
+                <w:sz w:val="18"/>
+              </w:rPr>
+              <w:t>1.0x~2.0x</w:t>
+            </w:r>
+          </w:p>
+        </w:tc>
+        <w:tc>
+          <w:tcPr>
+            <w:tcW w:type="dxa" w:w="2880"/>
+          </w:tcPr>
+          <w:p>
+            <w:r>
+              <w:rPr>
+                <w:sz w:val="18"/>
+              </w:rPr>
+              <w:t>모든 가치 평가의 기준점(1.0배)</w:t>
+            </w:r>
+          </w:p>
+        </w:tc>
+      </w:tr>
+    </w:tbl>
+    <w:p/>
+    <w:p>
+      <w:pPr>
+        <w:pStyle w:val="Heading1"/>
+      </w:pPr>
+      <w:r>
+        <w:t>8. 광고 배치</w:t>
+      </w:r>
+    </w:p>
+    <w:p>
+      <w:pPr>
         <w:pStyle w:val="Heading2"/>
       </w:pPr>
       <w:r>
-        <w:t>10-2. 업데이트 주기</w:t>
+        <w:t>보상형 광고</w:t>
+      </w:r>
+    </w:p>
+    <w:p>
+      <w:pPr>
+        <w:pStyle w:val="ListBullet"/>
+        <w:ind w:left="850"/>
+      </w:pPr>
+      <w:r>
+        <w:t>하트 충전 (하트 4개 이하)</w:t>
+      </w:r>
+    </w:p>
+    <w:p>
+      <w:pPr>
+        <w:pStyle w:val="ListBullet"/>
+        <w:ind w:left="850"/>
+      </w:pPr>
+      <w:r>
+        <w:t>부스터 1회 무료 사용 (판 진행 중)</w:t>
+      </w:r>
+    </w:p>
+    <w:p>
+      <w:pPr>
+        <w:pStyle w:val="ListBullet"/>
+        <w:ind w:left="850"/>
+      </w:pPr>
+      <w:r>
+        <w:t>코인 보상 2배 (데일리 보상)</w:t>
+      </w:r>
+    </w:p>
+    <w:p>
+      <w:pPr>
+        <w:pStyle w:val="ListBullet"/>
+        <w:ind w:left="850"/>
+      </w:pPr>
+      <w:r>
+        <w:t>컨티뉴 광고: 추후 추가 (피어 분석 필요)</w:t>
+      </w:r>
+    </w:p>
+    <w:p>
+      <w:pPr>
+        <w:pStyle w:val="Heading2"/>
+      </w:pPr>
+      <w:r>
+        <w:t>전면 광고</w:t>
+      </w:r>
+    </w:p>
+    <w:p>
+      <w:r>
+        <w:rPr>
+          <w:b/>
+          <w:sz w:val="20"/>
+        </w:rPr>
+        <w:t xml:space="preserve">보호 기간: </w:t>
+      </w:r>
+      <w:r>
+        <w:rPr>
+          <w:sz w:val="20"/>
+        </w:rPr>
+        <w:t>Lv.20까지 미노출 (FTUE 보호)</w:t>
+      </w:r>
+    </w:p>
+    <w:p>
+      <w:r>
+        <w:rPr>
+          <w:b/>
+          <w:sz w:val="20"/>
+        </w:rPr>
+        <w:t xml:space="preserve">타이밍: </w:t>
+      </w:r>
+      <w:r>
+        <w:rPr>
+          <w:sz w:val="20"/>
+        </w:rPr>
+        <w:t>레벨 결과 화면에서만</w:t>
+      </w:r>
+    </w:p>
+    <w:p>
+      <w:r>
+        <w:rPr>
+          <w:b/>
+          <w:sz w:val="20"/>
+        </w:rPr>
+        <w:t xml:space="preserve">쿨다운: </w:t>
+      </w:r>
+      <w:r>
+        <w:rPr>
+          <w:sz w:val="20"/>
+        </w:rPr>
+        <w:t>30초</w:t>
+      </w:r>
+    </w:p>
+    <w:p>
+      <w:pPr>
+        <w:pStyle w:val="Heading1"/>
+      </w:pPr>
+      <w:r>
+        <w:t>9. 시즌패스 (DEFERRED)</w:t>
+      </w:r>
+    </w:p>
+    <w:p>
+      <w:r>
+        <w:rPr>
+          <w:b/>
+          <w:sz w:val="20"/>
+        </w:rPr>
+        <w:t xml:space="preserve">구조: </w:t>
+      </w:r>
+      <w:r>
+        <w:rPr>
+          <w:sz w:val="20"/>
+        </w:rPr>
+        <w:t>업계 표준 구조</w:t>
+      </w:r>
+    </w:p>
+    <w:p>
+      <w:r>
+        <w:rPr>
+          <w:b/>
+          <w:sz w:val="20"/>
+        </w:rPr>
+        <w:t xml:space="preserve">무료 트랙: </w:t>
+      </w:r>
+      <w:r>
+        <w:rPr>
+          <w:sz w:val="20"/>
+        </w:rPr>
+        <w:t>기능적 보상 (코인, 부스터, 라이프 리필)</w:t>
+      </w:r>
+    </w:p>
+    <w:p>
+      <w:r>
+        <w:rPr>
+          <w:b/>
+          <w:sz w:val="20"/>
+        </w:rPr>
+        <w:t xml:space="preserve">프리미엄 트랙: </w:t>
+      </w:r>
+      <w:r>
+        <w:rPr>
+          <w:sz w:val="20"/>
+        </w:rPr>
+        <w:t>꾸미기 보상 (시즌 한정 풍선 이펙트, 다트/보관함 스킨)</w:t>
+      </w:r>
+    </w:p>
+    <w:p>
+      <w:r>
+        <w:rPr>
+          <w:b/>
+          <w:sz w:val="20"/>
+        </w:rPr>
+        <w:t xml:space="preserve">철학: </w:t>
+      </w:r>
+      <w:r>
+        <w:rPr>
+          <w:sz w:val="20"/>
+        </w:rPr>
+        <w:t>더 예쁘게 터뜨리는 경험이지, 더 쉽게 클리어하는 파워가 아님</w:t>
+      </w:r>
+    </w:p>
+    <w:p>
+      <w:r>
+        <w:t>※ BM/LiveOps 디렉션 완료 후 확정 예정</w:t>
+      </w:r>
+    </w:p>
+    <w:p>
+      <w:pPr>
+        <w:pStyle w:val="Heading1"/>
+      </w:pPr>
+      <w:r>
+        <w:t>10. 라이브 운영 (DEFERRED — 컨셉 확정분만 기록)</w:t>
+      </w:r>
+    </w:p>
+    <w:p>
+      <w:pPr>
+        <w:pStyle w:val="Heading2"/>
+      </w:pPr>
+      <w:r>
+        <w:t>10-1. 풍선 축제 (시즌 운영)</w:t>
+      </w:r>
+    </w:p>
+    <w:p>
+      <w:r>
+        <w:t>풍선의 비주얼만 교체하면 시즌이 갱신. 아트 리소스 교체 비용이 낮으면서 신선함 확보.</w:t>
+      </w:r>
+    </w:p>
+    <w:p>
+      <w:pPr>
+        <w:pStyle w:val="ListBullet"/>
+        <w:ind w:left="850"/>
+      </w:pPr>
+      <w:r>
+        <w:t>봄: 벚꽃 풍선</w:t>
+      </w:r>
+    </w:p>
+    <w:p>
+      <w:pPr>
+        <w:pStyle w:val="ListBullet"/>
+        <w:ind w:left="850"/>
+      </w:pPr>
+      <w:r>
+        <w:t>여름: 수박 풍선</w:t>
+      </w:r>
+    </w:p>
+    <w:p>
+      <w:pPr>
+        <w:pStyle w:val="ListBullet"/>
+        <w:ind w:left="850"/>
+      </w:pPr>
+      <w:r>
+        <w:t>할로윈: 호박 풍선</w:t>
+      </w:r>
+    </w:p>
+    <w:p>
+      <w:pPr>
+        <w:pStyle w:val="ListBullet"/>
+        <w:ind w:left="850"/>
+      </w:pPr>
+      <w:r>
+        <w:t>크리스마스: 오너먼트 풍선</w:t>
+      </w:r>
+    </w:p>
+    <w:p>
+      <w:pPr>
+        <w:pStyle w:val="Heading2"/>
+      </w:pPr>
+      <w:r>
+        <w:t>10-2. 연승 보너스</w:t>
+      </w:r>
+    </w:p>
+    <w:p>
+      <w:r>
+        <w:t>한 세션 안에서 연속 플레이를 유도하는 구조. 보너스 자체가 "더 많이 터뜨리는 경험"이라는 점이 핵심.</w:t>
       </w:r>
     </w:p>
     <w:tbl>
@@ -2969,7 +2378,7 @@
                 <w:color w:val="FFFFFF"/>
                 <w:sz w:val="18"/>
               </w:rPr>
-              <w:t>유형</w:t>
+              <w:t>연승</w:t>
             </w:r>
           </w:p>
         </w:tc>
@@ -2988,7 +2397,7 @@
                 <w:color w:val="FFFFFF"/>
                 <w:sz w:val="18"/>
               </w:rPr>
-              <w:t>주기</w:t>
+              <w:t>보상</w:t>
             </w:r>
           </w:p>
         </w:tc>
@@ -3003,7 +2412,7 @@
               <w:rPr>
                 <w:sz w:val="18"/>
               </w:rPr>
-              <w:t>content</w:t>
+              <w:t>3</w:t>
             </w:r>
           </w:p>
         </w:tc>
@@ -3016,7 +2425,7 @@
               <w:rPr>
                 <w:sz w:val="18"/>
               </w:rPr>
-              <w:t>4주마다 +20 levels (1 chapter)</w:t>
+              <w:t>클리어 시 보너스 풍선이 화면에 추가 등장 → 터지며 추가 보상</w:t>
             </w:r>
           </w:p>
         </w:tc>
@@ -3031,7 +2440,7 @@
               <w:rPr>
                 <w:sz w:val="18"/>
               </w:rPr>
-              <w:t>feature</w:t>
+              <w:t>5</w:t>
             </w:r>
           </w:p>
         </w:tc>
@@ -3044,7 +2453,7 @@
               <w:rPr>
                 <w:sz w:val="18"/>
               </w:rPr>
-              <w:t>8주마다 신규 기능 or 기믹</w:t>
+              <w:t>골드 풍선이 섞여 터지며 추가 코인 지급</w:t>
             </w:r>
           </w:p>
         </w:tc>
@@ -3059,7 +2468,7 @@
               <w:rPr>
                 <w:sz w:val="18"/>
               </w:rPr>
-              <w:t>balance</w:t>
+              <w:t>10</w:t>
             </w:r>
           </w:p>
         </w:tc>
@@ -3072,35 +2481,7 @@
               <w:rPr>
                 <w:sz w:val="18"/>
               </w:rPr>
-              <w:t>2주마다 밸런스 핫픽스 (데이터 기반)</w:t>
-            </w:r>
-          </w:p>
-        </w:tc>
-      </w:tr>
-      <w:tr>
-        <w:tc>
-          <w:tcPr>
-            <w:tcW w:type="dxa" w:w="4320"/>
-          </w:tcPr>
-          <w:p>
-            <w:r>
-              <w:rPr>
-                <w:sz w:val="18"/>
-              </w:rPr>
-              <w:t>client</w:t>
-            </w:r>
-          </w:p>
-        </w:tc>
-        <w:tc>
-          <w:tcPr>
-            <w:tcW w:type="dxa" w:w="4320"/>
-          </w:tcPr>
-          <w:p>
-            <w:r>
-              <w:rPr>
-                <w:sz w:val="18"/>
-              </w:rPr>
-              <w:t>4주마다 클라이언트 업데이트</w:t>
+              <w:t>특별 풍선이 연쇄로 팡팡팡 터지며 대량 보상</w:t>
             </w:r>
           </w:p>
         </w:tc>
@@ -3112,324 +2493,39 @@
         <w:pStyle w:val="Heading2"/>
       </w:pPr>
       <w:r>
-        <w:t>10-3. AB 테스트 계획</w:t>
+        <w:t>10-3. 데일리 챌린지 (오늘의 풍선)</w:t>
       </w:r>
     </w:p>
-    <w:tbl>
-      <w:tblPr>
-        <w:tblStyle w:val="TableGrid"/>
-        <w:tblW w:type="auto" w:w="0"/>
-        <w:jc w:val="center"/>
-        <w:tblLook w:firstColumn="1" w:firstRow="1" w:lastColumn="0" w:lastRow="0" w:noHBand="0" w:noVBand="1" w:val="04A0"/>
-      </w:tblPr>
-      <w:tblGrid>
-        <w:gridCol w:w="2160"/>
-        <w:gridCol w:w="2160"/>
-        <w:gridCol w:w="2160"/>
-        <w:gridCol w:w="2160"/>
-      </w:tblGrid>
-      <w:tr>
-        <w:tc>
-          <w:tcPr>
-            <w:tcW w:type="dxa" w:w="2160"/>
-            <w:shd w:val="clear" w:color="auto" w:fill="4472C4"/>
-          </w:tcPr>
-          <w:p>
-            <w:pPr>
-              <w:jc w:val="center"/>
-            </w:pPr>
-            <w:r>
-              <w:rPr>
-                <w:b/>
-                <w:color w:val="FFFFFF"/>
-                <w:sz w:val="18"/>
-              </w:rPr>
-              <w:t>테스트</w:t>
-            </w:r>
-          </w:p>
-        </w:tc>
-        <w:tc>
-          <w:tcPr>
-            <w:tcW w:type="dxa" w:w="2160"/>
-            <w:shd w:val="clear" w:color="auto" w:fill="4472C4"/>
-          </w:tcPr>
-          <w:p>
-            <w:pPr>
-              <w:jc w:val="center"/>
-            </w:pPr>
-            <w:r>
-              <w:rPr>
-                <w:b/>
-                <w:color w:val="FFFFFF"/>
-                <w:sz w:val="18"/>
-              </w:rPr>
-              <w:t>변형</w:t>
-            </w:r>
-          </w:p>
-        </w:tc>
-        <w:tc>
-          <w:tcPr>
-            <w:tcW w:type="dxa" w:w="2160"/>
-            <w:shd w:val="clear" w:color="auto" w:fill="4472C4"/>
-          </w:tcPr>
-          <w:p>
-            <w:pPr>
-              <w:jc w:val="center"/>
-            </w:pPr>
-            <w:r>
-              <w:rPr>
-                <w:b/>
-                <w:color w:val="FFFFFF"/>
-                <w:sz w:val="18"/>
-              </w:rPr>
-              <w:t>측정 지표</w:t>
-            </w:r>
-          </w:p>
-        </w:tc>
-        <w:tc>
-          <w:tcPr>
-            <w:tcW w:type="dxa" w:w="2160"/>
-            <w:shd w:val="clear" w:color="auto" w:fill="4472C4"/>
-          </w:tcPr>
-          <w:p>
-            <w:pPr>
-              <w:jc w:val="center"/>
-            </w:pPr>
-            <w:r>
-              <w:rPr>
-                <w:b/>
-                <w:color w:val="FFFFFF"/>
-                <w:sz w:val="18"/>
-              </w:rPr>
-              <w:t>기간</w:t>
-            </w:r>
-          </w:p>
-        </w:tc>
-      </w:tr>
-      <w:tr>
-        <w:tc>
-          <w:tcPr>
-            <w:tcW w:type="dxa" w:w="2160"/>
-          </w:tcPr>
-          <w:p>
-            <w:r>
-              <w:rPr>
-                <w:sz w:val="18"/>
-              </w:rPr>
-              <w:t>fail_condition</w:t>
-            </w:r>
-          </w:p>
-        </w:tc>
-        <w:tc>
-          <w:tcPr>
-            <w:tcW w:type="dxa" w:w="2160"/>
-          </w:tcPr>
-          <w:p>
-            <w:r>
-              <w:rPr>
-                <w:sz w:val="18"/>
-              </w:rPr>
-              <w:t>['rail_overflow_10', 'rail_overflow_8', 'dart_limit_only']</w:t>
-            </w:r>
-          </w:p>
-        </w:tc>
-        <w:tc>
-          <w:tcPr>
-            <w:tcW w:type="dxa" w:w="2160"/>
-          </w:tcPr>
-          <w:p>
-            <w:r>
-              <w:rPr>
-                <w:sz w:val="18"/>
-              </w:rPr>
-              <w:t>D7 retention + clear_rate</w:t>
-            </w:r>
-          </w:p>
-        </w:tc>
-        <w:tc>
-          <w:tcPr>
-            <w:tcW w:type="dxa" w:w="2160"/>
-          </w:tcPr>
-          <w:p>
-            <w:r>
-              <w:rPr>
-                <w:sz w:val="18"/>
-              </w:rPr>
-              <w:t>2주</w:t>
-            </w:r>
-          </w:p>
-        </w:tc>
-      </w:tr>
-      <w:tr>
-        <w:tc>
-          <w:tcPr>
-            <w:tcW w:type="dxa" w:w="2160"/>
-          </w:tcPr>
-          <w:p>
-            <w:r>
-              <w:rPr>
-                <w:sz w:val="18"/>
-              </w:rPr>
-              <w:t>interstitial_freq</w:t>
-            </w:r>
-          </w:p>
-        </w:tc>
-        <w:tc>
-          <w:tcPr>
-            <w:tcW w:type="dxa" w:w="2160"/>
-          </w:tcPr>
-          <w:p>
-            <w:r>
-              <w:rPr>
-                <w:sz w:val="18"/>
-              </w:rPr>
-              <w:t>['every_2_levels', 'every_3_levels', 'every_4_levels']</w:t>
-            </w:r>
-          </w:p>
-        </w:tc>
-        <w:tc>
-          <w:tcPr>
-            <w:tcW w:type="dxa" w:w="2160"/>
-          </w:tcPr>
-          <w:p>
-            <w:r>
-              <w:rPr>
-                <w:sz w:val="18"/>
-              </w:rPr>
-              <w:t>ad_revenue + D7_retention</w:t>
-            </w:r>
-          </w:p>
-        </w:tc>
-        <w:tc>
-          <w:tcPr>
-            <w:tcW w:type="dxa" w:w="2160"/>
-          </w:tcPr>
-          <w:p>
-            <w:r>
-              <w:rPr>
-                <w:sz w:val="18"/>
-              </w:rPr>
-              <w:t>2주</w:t>
-            </w:r>
-          </w:p>
-        </w:tc>
-      </w:tr>
-      <w:tr>
-        <w:tc>
-          <w:tcPr>
-            <w:tcW w:type="dxa" w:w="2160"/>
-          </w:tcPr>
-          <w:p>
-            <w:r>
-              <w:rPr>
-                <w:sz w:val="18"/>
-              </w:rPr>
-              <w:t>starter_pack_price</w:t>
-            </w:r>
-          </w:p>
-        </w:tc>
-        <w:tc>
-          <w:tcPr>
-            <w:tcW w:type="dxa" w:w="2160"/>
-          </w:tcPr>
-          <w:p>
-            <w:r>
-              <w:rPr>
-                <w:sz w:val="18"/>
-              </w:rPr>
-              <w:t>['$0.99', '$1.99', '$2.99']</w:t>
-            </w:r>
-          </w:p>
-        </w:tc>
-        <w:tc>
-          <w:tcPr>
-            <w:tcW w:type="dxa" w:w="2160"/>
-          </w:tcPr>
-          <w:p>
-            <w:r>
-              <w:rPr>
-                <w:sz w:val="18"/>
-              </w:rPr>
-              <w:t>conversion_rate + LTV</w:t>
-            </w:r>
-          </w:p>
-        </w:tc>
-        <w:tc>
-          <w:tcPr>
-            <w:tcW w:type="dxa" w:w="2160"/>
-          </w:tcPr>
-          <w:p>
-            <w:r>
-              <w:rPr>
-                <w:sz w:val="18"/>
-              </w:rPr>
-              <w:t>2주</w:t>
-            </w:r>
-          </w:p>
-        </w:tc>
-      </w:tr>
-      <w:tr>
-        <w:tc>
-          <w:tcPr>
-            <w:tcW w:type="dxa" w:w="2160"/>
-          </w:tcPr>
-          <w:p>
-            <w:r>
-              <w:rPr>
-                <w:sz w:val="18"/>
-              </w:rPr>
-              <w:t>piggy_bank_fill</w:t>
-            </w:r>
-          </w:p>
-        </w:tc>
-        <w:tc>
-          <w:tcPr>
-            <w:tcW w:type="dxa" w:w="2160"/>
-          </w:tcPr>
-          <w:p>
-            <w:r>
-              <w:rPr>
-                <w:sz w:val="18"/>
-              </w:rPr>
-              <w:t>['6판', '8판', '10판']</w:t>
-            </w:r>
-          </w:p>
-        </w:tc>
-        <w:tc>
-          <w:tcPr>
-            <w:tcW w:type="dxa" w:w="2160"/>
-          </w:tcPr>
-          <w:p>
-            <w:r>
-              <w:rPr>
-                <w:sz w:val="18"/>
-              </w:rPr>
-              <w:t>purchase_rate + satisfaction</w:t>
-            </w:r>
-          </w:p>
-        </w:tc>
-        <w:tc>
-          <w:tcPr>
-            <w:tcW w:type="dxa" w:w="2160"/>
-          </w:tcPr>
-          <w:p>
-            <w:r>
-              <w:rPr>
-                <w:sz w:val="18"/>
-              </w:rPr>
-              <w:t>2주</w:t>
-            </w:r>
-          </w:p>
-        </w:tc>
-      </w:tr>
-    </w:tbl>
-    <w:p/>
+    <w:p>
+      <w:r>
+        <w:t>매일 특수 조건의 레벨이 하나 열림</w:t>
+      </w:r>
+    </w:p>
     <w:p>
       <w:pPr>
-        <w:pStyle w:val="Heading1"/>
+        <w:pStyle w:val="ListBullet"/>
+        <w:ind w:left="850"/>
       </w:pPr>
       <w:r>
-        <w:t>11. 일일 퀘스트</w:t>
+        <w:t>빨간 풍선만 100개 터뜨리기</w:t>
+      </w:r>
+    </w:p>
+    <w:p>
+      <w:pPr>
+        <w:pStyle w:val="ListBullet"/>
+        <w:ind w:left="850"/>
+      </w:pPr>
+      <w:r>
+        <w:t>30초 안에 전부 클리어</w:t>
+      </w:r>
+    </w:p>
+    <w:p>
+      <w:pPr>
+        <w:pStyle w:val="ListBullet"/>
+        <w:ind w:left="850"/>
+      </w:pPr>
+      <w:r>
+        <w:t>보관함 3개로 보드 비우기</w:t>
       </w:r>
     </w:p>
     <w:p>
@@ -3438,55 +2534,18 @@
           <w:b/>
           <w:sz w:val="20"/>
         </w:rPr>
-        <w:t xml:space="preserve">일일 퀘스트 수: </w:t>
+        <w:t xml:space="preserve">보상: </w:t>
       </w:r>
       <w:r>
         <w:rPr>
           <w:sz w:val="20"/>
         </w:rPr>
-        <w:t>3</w:t>
-      </w:r>
-    </w:p>
-    <w:p>
-      <w:pPr>
-        <w:pStyle w:val="ListBullet"/>
-        <w:ind w:left="850"/>
-      </w:pPr>
-      <w:r>
-        <w:t>레벨 5개 클리어 → 코인 500</w:t>
-      </w:r>
-    </w:p>
-    <w:p>
-      <w:pPr>
-        <w:pStyle w:val="ListBullet"/>
-        <w:ind w:left="850"/>
-      </w:pPr>
-      <w:r>
-        <w:t>연쇄 팝 10회 달성 → 부스터 1개</w:t>
-      </w:r>
-    </w:p>
-    <w:p>
-      <w:pPr>
-        <w:pStyle w:val="ListBullet"/>
-        <w:ind w:left="850"/>
-      </w:pPr>
-      <w:r>
-        <w:t>스타 10개 획득 → 젬 5</w:t>
+        <w:t>클리어 시 시즌 패스 경험치 지급</w:t>
       </w:r>
     </w:p>
     <w:p>
       <w:r>
-        <w:rPr>
-          <w:b/>
-          <w:sz w:val="20"/>
-        </w:rPr>
-        <w:t xml:space="preserve">전부 완료 보너스: </w:t>
-      </w:r>
-      <w:r>
-        <w:rPr>
-          <w:sz w:val="20"/>
-        </w:rPr>
-        <w:t>3개 전부 완료 시 추가 보상 (젬 10 + 부스터)</w:t>
+        <w:t>※ 모든 LiveOps 시스템은 BM/LiveOps 디렉션 완료 후 구현 예정</w:t>
       </w:r>
     </w:p>
     <w:sectPr>

</xml_diff>